<commit_message>
[feature/JCF-1103] Remove development location and contact person clauses
- Remove Article 10 (Development Location) from both English and Japanese versions
- Remove Article 11 (Contact Persons) from both English and Japanese versions
- Renumber all subsequent articles accordingly
- Simplify contract structure by removing unnecessary clauses
- Maintain all essential protections and risk mitigations
</commit_message>
<xml_diff>
--- a/契約書/Lending/ Ysystem/Software Development Agreement.docx
+++ b/契約書/Lending/ Ysystem/Software Development Agreement.docx
@@ -997,28 +997,52 @@
           <w:szCs w:val="36"/>
           <w14:ligatures w14:val="none"/>
         </w:rPr>
-        <w:t>10. Development Location</w:t>
-      </w:r>
-    </w:p>
-    <w:p>
-      <w:pPr>
-        <w:widowControl/>
-        <w:spacing w:before="100" w:beforeAutospacing="1" w:after="100" w:afterAutospacing="1" w:line="240" w:lineRule="auto"/>
-        <w:rPr>
-          <w:rFonts w:ascii="Arial" w:eastAsia="ＭＳ Ｐゴシック" w:hAnsi="Arial" w:cs="Arial"/>
-          <w:kern w:val="0"/>
-          <w:sz w:val="24"/>
-          <w14:ligatures w14:val="none"/>
-        </w:rPr>
-      </w:pPr>
-      <w:r>
-        <w:rPr>
-          <w:rFonts w:ascii="Arial" w:eastAsia="ＭＳ Ｐゴシック" w:hAnsi="Arial" w:cs="Arial"/>
-          <w:kern w:val="0"/>
-          <w:sz w:val="24"/>
-          <w14:ligatures w14:val="none"/>
-        </w:rPr>
-        <w:t>Party A shall perform the Services at its business premises.</w:t>
+        <w:t>1</w:t>
+      </w:r>
+      <w:r>
+        <w:rPr>
+          <w:rFonts w:ascii="Arial" w:eastAsia="ＭＳ Ｐゴシック" w:hAnsi="Arial" w:cs="Arial"/>
+          <w:b/>
+          <w:bCs/>
+          <w:kern w:val="0"/>
+          <w:sz w:val="36"/>
+          <w:szCs w:val="36"/>
+          <w14:ligatures w14:val="none"/>
+        </w:rPr>
+        <w:t>0</w:t>
+      </w:r>
+      <w:r>
+        <w:rPr>
+          <w:rFonts w:ascii="Arial" w:eastAsia="ＭＳ Ｐゴシック" w:hAnsi="Arial" w:cs="Arial"/>
+          <w:b/>
+          <w:bCs/>
+          <w:kern w:val="0"/>
+          <w:sz w:val="36"/>
+          <w:szCs w:val="36"/>
+          <w14:ligatures w14:val="none"/>
+        </w:rPr>
+        <w:t>. Confidentiality</w:t>
+      </w:r>
+    </w:p>
+    <w:p>
+      <w:pPr>
+        <w:widowControl/>
+        <w:spacing w:before="100" w:beforeAutospacing="1" w:after="100" w:afterAutospacing="1" w:line="240" w:lineRule="auto"/>
+        <w:rPr>
+          <w:rFonts w:ascii="Arial" w:eastAsia="ＭＳ Ｐゴシック" w:hAnsi="Arial" w:cs="Arial"/>
+          <w:kern w:val="0"/>
+          <w:sz w:val="24"/>
+          <w14:ligatures w14:val="none"/>
+        </w:rPr>
+      </w:pPr>
+      <w:r>
+        <w:rPr>
+          <w:rFonts w:ascii="Arial" w:eastAsia="ＭＳ Ｐゴシック" w:hAnsi="Arial" w:cs="Arial"/>
+          <w:kern w:val="0"/>
+          <w:sz w:val="24"/>
+          <w14:ligatures w14:val="none"/>
+        </w:rPr>
+        <w:t>Both parties shall strictly manage and not disclose or leak any confidential information obtained from the other party in connection with this Agreement, except as required by law. This obligation shall survive termination of this Agreement.</w:t>
       </w:r>
     </w:p>
     <w:p>
@@ -1058,28 +1082,52 @@
           <w:szCs w:val="36"/>
           <w14:ligatures w14:val="none"/>
         </w:rPr>
-        <w:t>11. Contact Persons</w:t>
-      </w:r>
-    </w:p>
-    <w:p>
-      <w:pPr>
-        <w:widowControl/>
-        <w:spacing w:before="100" w:beforeAutospacing="1" w:after="100" w:afterAutospacing="1" w:line="240" w:lineRule="auto"/>
-        <w:rPr>
-          <w:rFonts w:ascii="Arial" w:eastAsia="ＭＳ Ｐゴシック" w:hAnsi="Arial" w:cs="Arial"/>
-          <w:kern w:val="0"/>
-          <w:sz w:val="24"/>
-          <w14:ligatures w14:val="none"/>
-        </w:rPr>
-      </w:pPr>
-      <w:r>
-        <w:rPr>
-          <w:rFonts w:ascii="Arial" w:eastAsia="ＭＳ Ｐゴシック" w:hAnsi="Arial" w:cs="Arial"/>
-          <w:kern w:val="0"/>
-          <w:sz w:val="24"/>
-          <w14:ligatures w14:val="none"/>
-        </w:rPr>
-        <w:t>Both parties shall designate contact persons for the Services and notify each other in writing, email, or other communication tools.</w:t>
+        <w:t>1</w:t>
+      </w:r>
+      <w:r>
+        <w:rPr>
+          <w:rFonts w:ascii="Arial" w:eastAsia="ＭＳ Ｐゴシック" w:hAnsi="Arial" w:cs="Arial"/>
+          <w:b/>
+          <w:bCs/>
+          <w:kern w:val="0"/>
+          <w:sz w:val="36"/>
+          <w:szCs w:val="36"/>
+          <w14:ligatures w14:val="none"/>
+        </w:rPr>
+        <w:t>1</w:t>
+      </w:r>
+      <w:r>
+        <w:rPr>
+          <w:rFonts w:ascii="Arial" w:eastAsia="ＭＳ Ｐゴシック" w:hAnsi="Arial" w:cs="Arial"/>
+          <w:b/>
+          <w:bCs/>
+          <w:kern w:val="0"/>
+          <w:sz w:val="36"/>
+          <w:szCs w:val="36"/>
+          <w14:ligatures w14:val="none"/>
+        </w:rPr>
+        <w:t>. Handling of Personal Information</w:t>
+      </w:r>
+    </w:p>
+    <w:p>
+      <w:pPr>
+        <w:widowControl/>
+        <w:spacing w:before="100" w:beforeAutospacing="1" w:after="100" w:afterAutospacing="1" w:line="240" w:lineRule="auto"/>
+        <w:rPr>
+          <w:rFonts w:ascii="Arial" w:eastAsia="ＭＳ Ｐゴシック" w:hAnsi="Arial" w:cs="Arial"/>
+          <w:kern w:val="0"/>
+          <w:sz w:val="24"/>
+          <w14:ligatures w14:val="none"/>
+        </w:rPr>
+      </w:pPr>
+      <w:r>
+        <w:rPr>
+          <w:rFonts w:ascii="Arial" w:eastAsia="ＭＳ Ｐゴシック" w:hAnsi="Arial" w:cs="Arial"/>
+          <w:kern w:val="0"/>
+          <w:sz w:val="24"/>
+          <w14:ligatures w14:val="none"/>
+        </w:rPr>
+        <w:t>Party A shall handle any personal information entrusted by Party B solely within the scope of this Agreement and shall not provide it to third parties without prior written consent from Party B.</w:t>
       </w:r>
     </w:p>
     <w:p>
@@ -1119,28 +1167,52 @@
           <w:szCs w:val="36"/>
           <w14:ligatures w14:val="none"/>
         </w:rPr>
-        <w:t>12. Confidentiality</w:t>
-      </w:r>
-    </w:p>
-    <w:p>
-      <w:pPr>
-        <w:widowControl/>
-        <w:spacing w:before="100" w:beforeAutospacing="1" w:after="100" w:afterAutospacing="1" w:line="240" w:lineRule="auto"/>
-        <w:rPr>
-          <w:rFonts w:ascii="Arial" w:eastAsia="ＭＳ Ｐゴシック" w:hAnsi="Arial" w:cs="Arial"/>
-          <w:kern w:val="0"/>
-          <w:sz w:val="24"/>
-          <w14:ligatures w14:val="none"/>
-        </w:rPr>
-      </w:pPr>
-      <w:r>
-        <w:rPr>
-          <w:rFonts w:ascii="Arial" w:eastAsia="ＭＳ Ｐゴシック" w:hAnsi="Arial" w:cs="Arial"/>
-          <w:kern w:val="0"/>
-          <w:sz w:val="24"/>
-          <w14:ligatures w14:val="none"/>
-        </w:rPr>
-        <w:t>Both parties shall strictly manage and not disclose or leak any confidential information obtained from the other party in connection with this Agreement, except as required by law. This obligation shall survive termination of this Agreement.</w:t>
+        <w:t>1</w:t>
+      </w:r>
+      <w:r>
+        <w:rPr>
+          <w:rFonts w:ascii="Arial" w:eastAsia="ＭＳ Ｐゴシック" w:hAnsi="Arial" w:cs="Arial"/>
+          <w:b/>
+          <w:bCs/>
+          <w:kern w:val="0"/>
+          <w:sz w:val="36"/>
+          <w:szCs w:val="36"/>
+          <w14:ligatures w14:val="none"/>
+        </w:rPr>
+        <w:t>2</w:t>
+      </w:r>
+      <w:r>
+        <w:rPr>
+          <w:rFonts w:ascii="Arial" w:eastAsia="ＭＳ Ｐゴシック" w:hAnsi="Arial" w:cs="Arial"/>
+          <w:b/>
+          <w:bCs/>
+          <w:kern w:val="0"/>
+          <w:sz w:val="36"/>
+          <w:szCs w:val="36"/>
+          <w14:ligatures w14:val="none"/>
+        </w:rPr>
+        <w:t>. Transfer of Ownership and Risk</w:t>
+      </w:r>
+    </w:p>
+    <w:p>
+      <w:pPr>
+        <w:widowControl/>
+        <w:spacing w:before="100" w:beforeAutospacing="1" w:after="100" w:afterAutospacing="1" w:line="240" w:lineRule="auto"/>
+        <w:rPr>
+          <w:rFonts w:ascii="Arial" w:eastAsia="ＭＳ Ｐゴシック" w:hAnsi="Arial" w:cs="Arial"/>
+          <w:kern w:val="0"/>
+          <w:sz w:val="24"/>
+          <w14:ligatures w14:val="none"/>
+        </w:rPr>
+      </w:pPr>
+      <w:r>
+        <w:rPr>
+          <w:rFonts w:ascii="Arial" w:eastAsia="ＭＳ Ｐゴシック" w:hAnsi="Arial" w:cs="Arial"/>
+          <w:kern w:val="0"/>
+          <w:sz w:val="24"/>
+          <w14:ligatures w14:val="none"/>
+        </w:rPr>
+        <w:t>Ownership and intellectual property rights of the Deliverables shall be transferred from Party A to Party B when Party B has fully paid the outsourcing fee.</w:t>
       </w:r>
     </w:p>
     <w:p>
@@ -1180,29 +1252,52 @@
           <w:szCs w:val="36"/>
           <w14:ligatures w14:val="none"/>
         </w:rPr>
-        <w:t>13. Handling of Personal Information</w:t>
-      </w:r>
-    </w:p>
-    <w:p>
-      <w:pPr>
-        <w:widowControl/>
-        <w:spacing w:before="100" w:beforeAutospacing="1" w:after="100" w:afterAutospacing="1" w:line="240" w:lineRule="auto"/>
-        <w:rPr>
-          <w:rFonts w:ascii="Arial" w:eastAsia="ＭＳ Ｐゴシック" w:hAnsi="Arial" w:cs="Arial"/>
-          <w:kern w:val="0"/>
-          <w:sz w:val="24"/>
-          <w14:ligatures w14:val="none"/>
-        </w:rPr>
-      </w:pPr>
-      <w:r>
-        <w:rPr>
-          <w:rFonts w:ascii="Arial" w:eastAsia="ＭＳ Ｐゴシック" w:hAnsi="Arial" w:cs="Arial"/>
-          <w:kern w:val="0"/>
-          <w:sz w:val="24"/>
-          <w14:ligatures w14:val="none"/>
-        </w:rPr>
-        <w:lastRenderedPageBreak/>
-        <w:t>Party A shall handle any personal information entrusted by Party B solely within the scope of this Agreement and shall not provide it to third parties without prior written consent from Party B.</w:t>
+        <w:t>1</w:t>
+      </w:r>
+      <w:r>
+        <w:rPr>
+          <w:rFonts w:ascii="Arial" w:eastAsia="ＭＳ Ｐゴシック" w:hAnsi="Arial" w:cs="Arial"/>
+          <w:b/>
+          <w:bCs/>
+          <w:kern w:val="0"/>
+          <w:sz w:val="36"/>
+          <w:szCs w:val="36"/>
+          <w14:ligatures w14:val="none"/>
+        </w:rPr>
+        <w:t>3</w:t>
+      </w:r>
+      <w:r>
+        <w:rPr>
+          <w:rFonts w:ascii="Arial" w:eastAsia="ＭＳ Ｐゴシック" w:hAnsi="Arial" w:cs="Arial"/>
+          <w:b/>
+          <w:bCs/>
+          <w:kern w:val="0"/>
+          <w:sz w:val="36"/>
+          <w:szCs w:val="36"/>
+          <w14:ligatures w14:val="none"/>
+        </w:rPr>
+        <w:t>. Inspection</w:t>
+      </w:r>
+    </w:p>
+    <w:p>
+      <w:pPr>
+        <w:widowControl/>
+        <w:spacing w:before="100" w:beforeAutospacing="1" w:after="100" w:afterAutospacing="1" w:line="240" w:lineRule="auto"/>
+        <w:rPr>
+          <w:rFonts w:ascii="Arial" w:eastAsia="ＭＳ Ｐゴシック" w:hAnsi="Arial" w:cs="Arial"/>
+          <w:kern w:val="0"/>
+          <w:sz w:val="24"/>
+          <w14:ligatures w14:val="none"/>
+        </w:rPr>
+      </w:pPr>
+      <w:r>
+        <w:rPr>
+          <w:rFonts w:ascii="Arial" w:eastAsia="ＭＳ Ｐゴシック" w:hAnsi="Arial" w:cs="Arial"/>
+          <w:kern w:val="0"/>
+          <w:sz w:val="24"/>
+          <w14:ligatures w14:val="none"/>
+        </w:rPr>
+        <w:t>Party B shall inspect the Deliverables within twenty (20) business days of delivery and notify Party A of any defects. If no notice is given within such period, the Deliverables shall be deemed accepted.</w:t>
       </w:r>
     </w:p>
     <w:p>
@@ -1242,129 +1337,31 @@
           <w:szCs w:val="36"/>
           <w14:ligatures w14:val="none"/>
         </w:rPr>
-        <w:t>14. Transfer of Ownership and Risk</w:t>
-      </w:r>
-    </w:p>
-    <w:p>
-      <w:pPr>
-        <w:widowControl/>
-        <w:spacing w:before="100" w:beforeAutospacing="1" w:after="100" w:afterAutospacing="1" w:line="240" w:lineRule="auto"/>
-        <w:rPr>
-          <w:rFonts w:ascii="Arial" w:eastAsia="ＭＳ Ｐゴシック" w:hAnsi="Arial" w:cs="Arial"/>
-          <w:kern w:val="0"/>
-          <w:sz w:val="24"/>
-          <w14:ligatures w14:val="none"/>
-        </w:rPr>
-      </w:pPr>
-      <w:r>
-        <w:rPr>
-          <w:rFonts w:ascii="Arial" w:eastAsia="ＭＳ Ｐゴシック" w:hAnsi="Arial" w:cs="Arial"/>
-          <w:kern w:val="0"/>
-          <w:sz w:val="24"/>
-          <w14:ligatures w14:val="none"/>
-        </w:rPr>
-        <w:t>Ownership and intellectual property rights of the Deliverables shall be transferred from Party A to Party B when Party B has fully paid the outsourcing fee.</w:t>
-      </w:r>
-    </w:p>
-    <w:p>
-      <w:pPr>
-        <w:widowControl/>
-        <w:spacing w:after="0" w:line="240" w:lineRule="auto"/>
-        <w:rPr>
-          <w:rFonts w:ascii="Arial" w:eastAsia="ＭＳ Ｐゴシック" w:hAnsi="Arial" w:cs="Arial"/>
-          <w:kern w:val="0"/>
-          <w:sz w:val="24"/>
-          <w14:ligatures w14:val="none"/>
-        </w:rPr>
-      </w:pPr>
-    </w:p>
-    <w:p>
-      <w:pPr>
-        <w:widowControl/>
-        <w:spacing w:before="100" w:beforeAutospacing="1" w:after="100" w:afterAutospacing="1" w:line="240" w:lineRule="auto"/>
-        <w:outlineLvl w:val="1"/>
-        <w:rPr>
-          <w:rFonts w:ascii="Arial" w:eastAsia="ＭＳ Ｐゴシック" w:hAnsi="Arial" w:cs="Arial"/>
-          <w:b/>
-          <w:bCs/>
-          <w:kern w:val="0"/>
-          <w:sz w:val="36"/>
-          <w:szCs w:val="36"/>
-          <w14:ligatures w14:val="none"/>
-        </w:rPr>
-      </w:pPr>
-      <w:r>
-        <w:rPr>
-          <w:rFonts w:ascii="Arial" w:eastAsia="ＭＳ Ｐゴシック" w:hAnsi="Arial" w:cs="Arial"/>
-          <w:b/>
-          <w:bCs/>
-          <w:kern w:val="0"/>
-          <w:sz w:val="36"/>
-          <w:szCs w:val="36"/>
-          <w14:ligatures w14:val="none"/>
-        </w:rPr>
-        <w:t>15. Inspection</w:t>
-      </w:r>
-    </w:p>
-    <w:p>
-      <w:pPr>
-        <w:widowControl/>
-        <w:spacing w:before="100" w:beforeAutospacing="1" w:after="100" w:afterAutospacing="1" w:line="240" w:lineRule="auto"/>
-        <w:rPr>
-          <w:rFonts w:ascii="Arial" w:eastAsia="ＭＳ Ｐゴシック" w:hAnsi="Arial" w:cs="Arial"/>
-          <w:kern w:val="0"/>
-          <w:sz w:val="24"/>
-          <w14:ligatures w14:val="none"/>
-        </w:rPr>
-      </w:pPr>
-      <w:r>
-        <w:rPr>
-          <w:rFonts w:ascii="Arial" w:eastAsia="ＭＳ Ｐゴシック" w:hAnsi="Arial" w:cs="Arial"/>
-          <w:kern w:val="0"/>
-          <w:sz w:val="24"/>
-          <w14:ligatures w14:val="none"/>
-        </w:rPr>
-        <w:t>Party B shall inspect the Deliverables within twenty (20) business days of delivery and notify Party A of any defects. If no notice is given within such period, the Deliverables shall be deemed accepted.</w:t>
-      </w:r>
-    </w:p>
-    <w:p>
-      <w:pPr>
-        <w:widowControl/>
-        <w:spacing w:after="0" w:line="240" w:lineRule="auto"/>
-        <w:rPr>
-          <w:rFonts w:ascii="Arial" w:eastAsia="ＭＳ Ｐゴシック" w:hAnsi="Arial" w:cs="Arial"/>
-          <w:kern w:val="0"/>
-          <w:sz w:val="24"/>
-          <w14:ligatures w14:val="none"/>
-        </w:rPr>
-      </w:pPr>
-    </w:p>
-    <w:p>
-      <w:pPr>
-        <w:widowControl/>
-        <w:spacing w:before="100" w:beforeAutospacing="1" w:after="100" w:afterAutospacing="1" w:line="240" w:lineRule="auto"/>
-        <w:outlineLvl w:val="1"/>
-        <w:rPr>
-          <w:rFonts w:ascii="Arial" w:eastAsia="ＭＳ Ｐゴシック" w:hAnsi="Arial" w:cs="Arial"/>
-          <w:b/>
-          <w:bCs/>
-          <w:kern w:val="0"/>
-          <w:sz w:val="36"/>
-          <w:szCs w:val="36"/>
-          <w14:ligatures w14:val="none"/>
-        </w:rPr>
-      </w:pPr>
-      <w:r>
-        <w:rPr>
-          <w:rFonts w:ascii="Arial" w:eastAsia="ＭＳ Ｐゴシック" w:hAnsi="Arial" w:cs="Arial"/>
-          <w:b/>
-          <w:bCs/>
-          <w:kern w:val="0"/>
-          <w:sz w:val="36"/>
-          <w:szCs w:val="36"/>
-          <w14:ligatures w14:val="none"/>
-        </w:rPr>
-        <w:t>16. Warranty and Liability</w:t>
+        <w:t>1</w:t>
+      </w:r>
+      <w:r>
+        <w:rPr>
+          <w:rFonts w:ascii="Arial" w:eastAsia="ＭＳ Ｐゴシック" w:hAnsi="Arial" w:cs="Arial"/>
+          <w:b/>
+          <w:bCs/>
+          <w:kern w:val="0"/>
+          <w:sz w:val="36"/>
+          <w:szCs w:val="36"/>
+          <w14:ligatures w14:val="none"/>
+        </w:rPr>
+        <w:t>4</w:t>
+      </w:r>
+      <w:r>
+        <w:rPr>
+          <w:rFonts w:ascii="Arial" w:eastAsia="ＭＳ Ｐゴシック" w:hAnsi="Arial" w:cs="Arial"/>
+          <w:b/>
+          <w:bCs/>
+          <w:kern w:val="0"/>
+          <w:sz w:val="36"/>
+          <w:szCs w:val="36"/>
+          <w14:ligatures w14:val="none"/>
+        </w:rPr>
+        <w:t>. Warranty and Liability</w:t>
       </w:r>
     </w:p>
     <w:p>
@@ -1479,29 +1476,299 @@
           <w:szCs w:val="36"/>
           <w14:ligatures w14:val="none"/>
         </w:rPr>
-        <w:t>17. Maintenance Services</w:t>
-      </w:r>
-    </w:p>
-    <w:p>
-      <w:pPr>
-        <w:widowControl/>
-        <w:spacing w:before="100" w:beforeAutospacing="1" w:after="100" w:afterAutospacing="1" w:line="240" w:lineRule="auto"/>
-        <w:rPr>
-          <w:rFonts w:ascii="Arial" w:eastAsia="ＭＳ Ｐゴシック" w:hAnsi="Arial" w:cs="Arial"/>
-          <w:kern w:val="0"/>
-          <w:sz w:val="24"/>
-          <w14:ligatures w14:val="none"/>
-        </w:rPr>
-      </w:pPr>
-      <w:r>
-        <w:rPr>
-          <w:rFonts w:ascii="Arial" w:eastAsia="ＭＳ Ｐゴシック" w:hAnsi="Arial" w:cs="Arial"/>
-          <w:kern w:val="0"/>
-          <w:sz w:val="24"/>
-          <w14:ligatures w14:val="none"/>
+        <w:t>1</w:t>
+      </w:r>
+      <w:r>
+        <w:rPr>
+          <w:rFonts w:ascii="Arial" w:eastAsia="ＭＳ Ｐゴシック" w:hAnsi="Arial" w:cs="Arial"/>
+          <w:b/>
+          <w:bCs/>
+          <w:kern w:val="0"/>
+          <w:sz w:val="36"/>
+          <w:szCs w:val="36"/>
+          <w14:ligatures w14:val="none"/>
+        </w:rPr>
+        <w:t>5</w:t>
+      </w:r>
+      <w:r>
+        <w:rPr>
+          <w:rFonts w:ascii="Arial" w:eastAsia="ＭＳ Ｐゴシック" w:hAnsi="Arial" w:cs="Arial"/>
+          <w:b/>
+          <w:bCs/>
+          <w:kern w:val="0"/>
+          <w:sz w:val="36"/>
+          <w:szCs w:val="36"/>
+          <w14:ligatures w14:val="none"/>
+        </w:rPr>
+        <w:t>. Maintenance Services</w:t>
+      </w:r>
+    </w:p>
+    <w:p>
+      <w:pPr>
+        <w:widowControl/>
+        <w:spacing w:before="100" w:beforeAutospacing="1" w:after="100" w:afterAutospacing="1" w:line="240" w:lineRule="auto"/>
+        <w:rPr>
+          <w:rFonts w:ascii="Arial" w:eastAsia="ＭＳ Ｐゴシック" w:hAnsi="Arial" w:cs="Arial"/>
+          <w:kern w:val="0"/>
+          <w:sz w:val="24"/>
+          <w14:ligatures w14:val="none"/>
+        </w:rPr>
+      </w:pPr>
+      <w:r>
+        <w:rPr>
+          <w:rFonts w:ascii="Arial" w:eastAsia="ＭＳ Ｐゴシック" w:hAnsi="Arial" w:cs="Arial"/>
+          <w:kern w:val="0"/>
+          <w:sz w:val="24"/>
+          <w14:ligatures w14:val="none"/>
+        </w:rPr>
+        <w:t>After expiration of the warranty period, any maintenance or technical support shall be subject to a separate agreement.</w:t>
+      </w:r>
+    </w:p>
+    <w:p>
+      <w:pPr>
+        <w:widowControl/>
+        <w:spacing w:after="0" w:line="240" w:lineRule="auto"/>
+        <w:rPr>
+          <w:rFonts w:ascii="Arial" w:eastAsia="ＭＳ Ｐゴシック" w:hAnsi="Arial" w:cs="Arial"/>
+          <w:kern w:val="0"/>
+          <w:sz w:val="24"/>
+          <w14:ligatures w14:val="none"/>
+        </w:rPr>
+      </w:pPr>
+    </w:p>
+    <w:p>
+      <w:pPr>
+        <w:widowControl/>
+        <w:spacing w:before="100" w:beforeAutospacing="1" w:after="100" w:afterAutospacing="1" w:line="240" w:lineRule="auto"/>
+        <w:outlineLvl w:val="1"/>
+        <w:rPr>
+          <w:rFonts w:ascii="Arial" w:eastAsia="ＭＳ Ｐゴシック" w:hAnsi="Arial" w:cs="Arial"/>
+          <w:b/>
+          <w:bCs/>
+          <w:kern w:val="0"/>
+          <w:sz w:val="36"/>
+          <w:szCs w:val="36"/>
+          <w14:ligatures w14:val="none"/>
+        </w:rPr>
+      </w:pPr>
+      <w:r>
+        <w:rPr>
+          <w:rFonts w:ascii="Arial" w:eastAsia="ＭＳ Ｐゴシック" w:hAnsi="Arial" w:cs="Arial"/>
+          <w:b/>
+          <w:bCs/>
+          <w:kern w:val="0"/>
+          <w:sz w:val="36"/>
+          <w:szCs w:val="36"/>
+          <w14:ligatures w14:val="none"/>
+        </w:rPr>
+        <w:t>1</w:t>
+      </w:r>
+      <w:r>
+        <w:rPr>
+          <w:rFonts w:ascii="Arial" w:eastAsia="ＭＳ Ｐゴシック" w:hAnsi="Arial" w:cs="Arial"/>
+          <w:b/>
+          <w:bCs/>
+          <w:kern w:val="0"/>
+          <w:sz w:val="36"/>
+          <w:szCs w:val="36"/>
+          <w14:ligatures w14:val="none"/>
+        </w:rPr>
+        <w:t>6</w:t>
+      </w:r>
+      <w:r>
+        <w:rPr>
+          <w:rFonts w:ascii="Arial" w:eastAsia="ＭＳ Ｐゴシック" w:hAnsi="Arial" w:cs="Arial"/>
+          <w:b/>
+          <w:bCs/>
+          <w:kern w:val="0"/>
+          <w:sz w:val="36"/>
+          <w:szCs w:val="36"/>
+          <w14:ligatures w14:val="none"/>
+        </w:rPr>
+        <w:t>. Copyright</w:t>
+      </w:r>
+    </w:p>
+    <w:p>
+      <w:pPr>
+        <w:pStyle w:val="Web"/>
+        <w:rPr>
+          <w:rFonts w:ascii="Arial" w:hAnsi="Arial" w:cs="Arial"/>
+        </w:rPr>
+      </w:pPr>
+      <w:r>
+        <w:rPr>
+          <w:rFonts w:ascii="Arial" w:hAnsi="Arial" w:cs="Arial"/>
+        </w:rPr>
+        <w:t>1. Copyright of Newly Developed Features</w:t>
+      </w:r>
+    </w:p>
+    <w:p>
+      <w:pPr>
+        <w:pStyle w:val="Web"/>
+        <w:rPr>
+          <w:rFonts w:ascii="Arial" w:hAnsi="Arial" w:cs="Arial"/>
+        </w:rPr>
+      </w:pPr>
+      <w:r>
+        <w:rPr>
+          <w:rFonts w:ascii="Arial" w:hAnsi="Arial" w:cs="Arial"/>
+        </w:rPr>
+        <w:t>All copyrights and ownership rights to newly developed features under this Agreement shall belong exclusively to Party B. Party B may freely use, modify, and license such Deliverables, including granting rights to third parties.</w:t>
+      </w:r>
+    </w:p>
+    <w:p>
+      <w:pPr>
+        <w:pStyle w:val="Web"/>
+        <w:rPr>
+          <w:rFonts w:ascii="Arial" w:hAnsi="Arial" w:cs="Arial"/>
+        </w:rPr>
+      </w:pPr>
+      <w:r>
+        <w:rPr>
+          <w:rFonts w:ascii="Arial" w:hAnsi="Arial" w:cs="Arial"/>
         </w:rPr>
         <w:lastRenderedPageBreak/>
-        <w:t>After expiration of the warranty period, any maintenance or technical support shall be subject to a separate agreement.</w:t>
+        <w:t>2. Rights to Existing Technology</w:t>
+      </w:r>
+    </w:p>
+    <w:p>
+      <w:pPr>
+        <w:pStyle w:val="Web"/>
+        <w:rPr>
+          <w:rFonts w:ascii="Arial" w:hAnsi="Arial" w:cs="Arial" w:hint="eastAsia"/>
+        </w:rPr>
+      </w:pPr>
+      <w:r>
+        <w:rPr>
+          <w:rFonts w:ascii="Arial" w:hAnsi="Arial" w:cs="Arial"/>
+        </w:rPr>
+        <w:t>Party A shall have the right to use its existing technology, know-how, libraries, frameworks, and other intellectual property (hereinafter referred to as "Existing Technology") in performing the Services. Copyrights and ownership rights to Existing Technology shall remain with Party A and shall not be transferred to Party B.</w:t>
+      </w:r>
+    </w:p>
+    <w:p>
+      <w:pPr>
+        <w:pStyle w:val="Web"/>
+        <w:rPr>
+          <w:rFonts w:ascii="Arial" w:hAnsi="Arial" w:cs="Arial"/>
+        </w:rPr>
+      </w:pPr>
+      <w:r>
+        <w:rPr>
+          <w:rFonts w:ascii="Arial" w:hAnsi="Arial" w:cs="Arial"/>
+        </w:rPr>
+        <w:t>3. Exclusion of Generic Technical Elements</w:t>
+      </w:r>
+    </w:p>
+    <w:p>
+      <w:pPr>
+        <w:pStyle w:val="Web"/>
+        <w:rPr>
+          <w:rFonts w:ascii="Arial" w:hAnsi="Arial" w:cs="Arial"/>
+        </w:rPr>
+      </w:pPr>
+      <w:r>
+        <w:rPr>
+          <w:rFonts w:ascii="Arial" w:hAnsi="Arial" w:cs="Arial"/>
+        </w:rPr>
+        <w:t xml:space="preserve">The following generic technical elements shall remain the property of Party </w:t>
+      </w:r>
+      <w:proofErr w:type="spellStart"/>
+      <w:r>
+        <w:rPr>
+          <w:rFonts w:ascii="Arial" w:hAnsi="Arial" w:cs="Arial"/>
+        </w:rPr>
+        <w:t>A</w:t>
+      </w:r>
+      <w:proofErr w:type="spellEnd"/>
+      <w:r>
+        <w:rPr>
+          <w:rFonts w:ascii="Arial" w:hAnsi="Arial" w:cs="Arial"/>
+        </w:rPr>
+        <w:t xml:space="preserve"> even if included in the Deliverables under this Agreement:</w:t>
+      </w:r>
+    </w:p>
+    <w:p>
+      <w:pPr>
+        <w:pStyle w:val="Web"/>
+        <w:rPr>
+          <w:rFonts w:ascii="Arial" w:hAnsi="Arial" w:cs="Arial"/>
+        </w:rPr>
+      </w:pPr>
+      <w:r>
+        <w:rPr>
+          <w:rFonts w:ascii="Arial" w:hAnsi="Arial" w:cs="Arial"/>
+        </w:rPr>
+        <w:t>- General algorithms and data structures</w:t>
+      </w:r>
+    </w:p>
+    <w:p>
+      <w:pPr>
+        <w:pStyle w:val="Web"/>
+        <w:rPr>
+          <w:rFonts w:ascii="Arial" w:hAnsi="Arial" w:cs="Arial"/>
+        </w:rPr>
+      </w:pPr>
+      <w:r>
+        <w:rPr>
+          <w:rFonts w:ascii="Arial" w:hAnsi="Arial" w:cs="Arial"/>
+        </w:rPr>
+        <w:t>- Standard programming techniques and design patterns</w:t>
+      </w:r>
+    </w:p>
+    <w:p>
+      <w:pPr>
+        <w:pStyle w:val="Web"/>
+        <w:rPr>
+          <w:rFonts w:ascii="Arial" w:hAnsi="Arial" w:cs="Arial"/>
+        </w:rPr>
+      </w:pPr>
+      <w:r>
+        <w:rPr>
+          <w:rFonts w:ascii="Arial" w:hAnsi="Arial" w:cs="Arial"/>
+        </w:rPr>
+        <w:t xml:space="preserve">- </w:t>
+      </w:r>
+      <w:proofErr w:type="gramStart"/>
+      <w:r>
+        <w:rPr>
+          <w:rFonts w:ascii="Arial" w:hAnsi="Arial" w:cs="Arial"/>
+        </w:rPr>
+        <w:t>Open source</w:t>
+      </w:r>
+      <w:proofErr w:type="gramEnd"/>
+      <w:r>
+        <w:rPr>
+          <w:rFonts w:ascii="Arial" w:hAnsi="Arial" w:cs="Arial"/>
+        </w:rPr>
+        <w:t xml:space="preserve"> libraries and frameworks</w:t>
+      </w:r>
+    </w:p>
+    <w:p>
+      <w:pPr>
+        <w:pStyle w:val="Web"/>
+        <w:rPr>
+          <w:rFonts w:ascii="Arial" w:hAnsi="Arial" w:cs="Arial"/>
+        </w:rPr>
+      </w:pPr>
+      <w:r>
+        <w:rPr>
+          <w:rFonts w:ascii="Arial" w:hAnsi="Arial" w:cs="Arial"/>
+        </w:rPr>
+        <w:t>- Reusable components developed by Party A for other projects</w:t>
+      </w:r>
+    </w:p>
+    <w:p>
+      <w:pPr>
+        <w:pStyle w:val="Web"/>
+        <w:rPr>
+          <w:rFonts w:ascii="Arial" w:hAnsi="Arial" w:cs="Arial"/>
+        </w:rPr>
+      </w:pPr>
+      <w:r>
+        <w:rPr>
+          <w:rFonts w:ascii="Arial" w:hAnsi="Arial" w:cs="Arial"/>
+        </w:rPr>
+        <w:t>- General user interface elements and layouts</w:t>
       </w:r>
     </w:p>
     <w:p>
@@ -1541,7 +1808,31 @@
           <w:szCs w:val="36"/>
           <w14:ligatures w14:val="none"/>
         </w:rPr>
-        <w:t>18. Copyright</w:t>
+        <w:t>1</w:t>
+      </w:r>
+      <w:r>
+        <w:rPr>
+          <w:rFonts w:ascii="Arial" w:eastAsia="ＭＳ Ｐゴシック" w:hAnsi="Arial" w:cs="Arial"/>
+          <w:b/>
+          <w:bCs/>
+          <w:kern w:val="0"/>
+          <w:sz w:val="36"/>
+          <w:szCs w:val="36"/>
+          <w14:ligatures w14:val="none"/>
+        </w:rPr>
+        <w:t>7</w:t>
+      </w:r>
+      <w:r>
+        <w:rPr>
+          <w:rFonts w:ascii="Arial" w:eastAsia="ＭＳ Ｐゴシック" w:hAnsi="Arial" w:cs="Arial"/>
+          <w:b/>
+          <w:bCs/>
+          <w:kern w:val="0"/>
+          <w:sz w:val="36"/>
+          <w:szCs w:val="36"/>
+          <w14:ligatures w14:val="none"/>
+        </w:rPr>
+        <w:t>. Liability and Compensation</w:t>
       </w:r>
     </w:p>
     <w:p>
@@ -1555,7 +1846,7 @@
         <w:rPr>
           <w:rFonts w:ascii="Arial" w:hAnsi="Arial" w:cs="Arial"/>
         </w:rPr>
-        <w:t>1. Copyright of Newly Developed Features</w:t>
+        <w:t>1. Liability for Damages</w:t>
       </w:r>
     </w:p>
     <w:p>
@@ -1569,7 +1860,7 @@
         <w:rPr>
           <w:rFonts w:ascii="Arial" w:hAnsi="Arial" w:cs="Arial"/>
         </w:rPr>
-        <w:t>All copyrights and ownership rights to newly developed features under this Agreement shall belong exclusively to Party B. Party B may freely use, modify, and license such Deliverables, including granting rights to third parties.</w:t>
+        <w:t>Party A shall be liable for damages arising from infringement of third-party rights or defects in the Deliverables, provided that such liability shall be limited to 200% of the total amount of the outsourcing fee.</w:t>
       </w:r>
     </w:p>
     <w:p>
@@ -1583,21 +1874,21 @@
         <w:rPr>
           <w:rFonts w:ascii="Arial" w:hAnsi="Arial" w:cs="Arial"/>
         </w:rPr>
-        <w:t>2. Rights to Existing Technology</w:t>
+        <w:t>2. Exclusion of Indirect Damages</w:t>
       </w:r>
     </w:p>
     <w:p>
       <w:pPr>
         <w:pStyle w:val="Web"/>
         <w:rPr>
-          <w:rFonts w:ascii="Arial" w:hAnsi="Arial" w:cs="Arial" w:hint="eastAsia"/>
-        </w:rPr>
-      </w:pPr>
-      <w:r>
-        <w:rPr>
-          <w:rFonts w:ascii="Arial" w:hAnsi="Arial" w:cs="Arial"/>
-        </w:rPr>
-        <w:t>Party A shall have the right to use its existing technology, know-how, libraries, frameworks, and other intellectual property (hereinafter referred to as "Existing Technology") in performing the Services. Copyrights and ownership rights to Existing Technology shall remain with Party A and shall not be transferred to Party B.</w:t>
+          <w:rFonts w:ascii="Arial" w:hAnsi="Arial" w:cs="Arial"/>
+        </w:rPr>
+      </w:pPr>
+      <w:r>
+        <w:rPr>
+          <w:rFonts w:ascii="Arial" w:hAnsi="Arial" w:cs="Arial"/>
+        </w:rPr>
+        <w:t>Party A shall not be liable for lost profits, loss of opportunity, indirect damages, special damages, or punitive damages.</w:t>
       </w:r>
     </w:p>
     <w:p>
@@ -1611,7 +1902,8 @@
         <w:rPr>
           <w:rFonts w:ascii="Arial" w:hAnsi="Arial" w:cs="Arial"/>
         </w:rPr>
-        <w:t>3. Exclusion of Generic Technical Elements</w:t>
+        <w:lastRenderedPageBreak/>
+        <w:t>3. Exemptions</w:t>
       </w:r>
     </w:p>
     <w:p>
@@ -1625,21 +1917,7 @@
         <w:rPr>
           <w:rFonts w:ascii="Arial" w:hAnsi="Arial" w:cs="Arial"/>
         </w:rPr>
-        <w:t xml:space="preserve">The following generic technical elements shall remain the property of Party </w:t>
-      </w:r>
-      <w:proofErr w:type="spellStart"/>
-      <w:r>
-        <w:rPr>
-          <w:rFonts w:ascii="Arial" w:hAnsi="Arial" w:cs="Arial"/>
-        </w:rPr>
-        <w:t>A</w:t>
-      </w:r>
-      <w:proofErr w:type="spellEnd"/>
-      <w:r>
-        <w:rPr>
-          <w:rFonts w:ascii="Arial" w:hAnsi="Arial" w:cs="Arial"/>
-        </w:rPr>
-        <w:t xml:space="preserve"> even if included in the Deliverables under this Agreement:</w:t>
+        <w:t>Party A shall not be liable for damages in the following cases:</w:t>
       </w:r>
     </w:p>
     <w:p>
@@ -1653,7 +1931,7 @@
         <w:rPr>
           <w:rFonts w:ascii="Arial" w:hAnsi="Arial" w:cs="Arial"/>
         </w:rPr>
-        <w:t>- General algorithms and data structures</w:t>
+        <w:t>- Damages caused by errors or deficiencies in materials provided by Party B</w:t>
       </w:r>
     </w:p>
     <w:p>
@@ -1667,7 +1945,7 @@
         <w:rPr>
           <w:rFonts w:ascii="Arial" w:hAnsi="Arial" w:cs="Arial"/>
         </w:rPr>
-        <w:t>- Standard programming techniques and design patterns</w:t>
+        <w:t>- Damages arising from specification changes instructed by Party B</w:t>
       </w:r>
     </w:p>
     <w:p>
@@ -1681,21 +1959,213 @@
         <w:rPr>
           <w:rFonts w:ascii="Arial" w:hAnsi="Arial" w:cs="Arial"/>
         </w:rPr>
-        <w:t xml:space="preserve">- </w:t>
+        <w:t>- Damages caused by improper use or operation by Party B</w:t>
+      </w:r>
+    </w:p>
+    <w:p>
+      <w:pPr>
+        <w:pStyle w:val="Web"/>
+        <w:rPr>
+          <w:rFonts w:ascii="Arial" w:hAnsi="Arial" w:cs="Arial"/>
+        </w:rPr>
+      </w:pPr>
+      <w:r>
+        <w:rPr>
+          <w:rFonts w:ascii="Arial" w:hAnsi="Arial" w:cs="Arial"/>
+        </w:rPr>
+        <w:t>- Damages caused by unauthorized access or tampering by third parties</w:t>
+      </w:r>
+    </w:p>
+    <w:p>
+      <w:pPr>
+        <w:widowControl/>
+        <w:spacing w:after="0" w:line="240" w:lineRule="auto"/>
+        <w:rPr>
+          <w:rFonts w:ascii="Arial" w:eastAsia="ＭＳ Ｐゴシック" w:hAnsi="Arial" w:cs="Arial"/>
+          <w:kern w:val="0"/>
+          <w:sz w:val="24"/>
+          <w14:ligatures w14:val="none"/>
+        </w:rPr>
+      </w:pPr>
+    </w:p>
+    <w:p>
+      <w:pPr>
+        <w:widowControl/>
+        <w:spacing w:before="100" w:beforeAutospacing="1" w:after="100" w:afterAutospacing="1" w:line="240" w:lineRule="auto"/>
+        <w:outlineLvl w:val="1"/>
+        <w:rPr>
+          <w:rFonts w:ascii="Arial" w:eastAsia="ＭＳ Ｐゴシック" w:hAnsi="Arial" w:cs="Arial"/>
+          <w:b/>
+          <w:bCs/>
+          <w:kern w:val="0"/>
+          <w:sz w:val="36"/>
+          <w:szCs w:val="36"/>
+          <w14:ligatures w14:val="none"/>
+        </w:rPr>
+      </w:pPr>
+      <w:r>
+        <w:rPr>
+          <w:rFonts w:ascii="Arial" w:eastAsia="ＭＳ Ｐゴシック" w:hAnsi="Arial" w:cs="Arial"/>
+          <w:b/>
+          <w:bCs/>
+          <w:kern w:val="0"/>
+          <w:sz w:val="36"/>
+          <w:szCs w:val="36"/>
+          <w14:ligatures w14:val="none"/>
+        </w:rPr>
+        <w:t>18</w:t>
+      </w:r>
+      <w:r>
+        <w:rPr>
+          <w:rFonts w:ascii="Arial" w:eastAsia="ＭＳ Ｐゴシック" w:hAnsi="Arial" w:cs="Arial"/>
+          <w:b/>
+          <w:bCs/>
+          <w:kern w:val="0"/>
+          <w:sz w:val="36"/>
+          <w:szCs w:val="36"/>
+          <w14:ligatures w14:val="none"/>
+        </w:rPr>
+        <w:t>. Term of Agreement</w:t>
+      </w:r>
+    </w:p>
+    <w:p>
+      <w:pPr>
+        <w:widowControl/>
+        <w:spacing w:before="100" w:beforeAutospacing="1" w:after="100" w:afterAutospacing="1" w:line="240" w:lineRule="auto"/>
+        <w:rPr>
+          <w:rFonts w:ascii="Arial" w:eastAsia="ＭＳ Ｐゴシック" w:hAnsi="Arial" w:cs="Arial"/>
+          <w:kern w:val="0"/>
+          <w:sz w:val="24"/>
+          <w14:ligatures w14:val="none"/>
+        </w:rPr>
+      </w:pPr>
+      <w:r>
+        <w:rPr>
+          <w:rFonts w:ascii="Arial" w:eastAsia="ＭＳ Ｐゴシック" w:hAnsi="Arial" w:cs="Arial"/>
+          <w:kern w:val="0"/>
+          <w:sz w:val="24"/>
+          <w14:ligatures w14:val="none"/>
+        </w:rPr>
+        <w:t xml:space="preserve">The term of this Agreement shall be </w:t>
       </w:r>
       <w:proofErr w:type="gramStart"/>
       <w:r>
         <w:rPr>
-          <w:rFonts w:ascii="Arial" w:hAnsi="Arial" w:cs="Arial"/>
-        </w:rPr>
-        <w:t>Open source</w:t>
+          <w:rFonts w:ascii="Arial" w:eastAsia="ＭＳ Ｐゴシック" w:hAnsi="Arial" w:cs="Arial"/>
+          <w:kern w:val="0"/>
+          <w:sz w:val="24"/>
+          <w14:ligatures w14:val="none"/>
+        </w:rPr>
+        <w:t>from</w:t>
+      </w:r>
+      <w:r>
+        <w:rPr>
+          <w:rFonts w:ascii="Arial" w:eastAsia="ＭＳ Ｐゴシック" w:hAnsi="Arial" w:cs="Arial"/>
+          <w:kern w:val="0"/>
+          <w:sz w:val="24"/>
+          <w14:ligatures w14:val="none"/>
+        </w:rPr>
+        <w:t xml:space="preserve"> </w:t>
+      </w:r>
+      <w:r>
+        <w:rPr>
+          <w:rFonts w:ascii="Arial" w:eastAsia="ＭＳ Ｐゴシック" w:hAnsi="Arial" w:cs="Arial"/>
+          <w:color w:val="EE0000"/>
+          <w:kern w:val="0"/>
+          <w:sz w:val="24"/>
+          <w14:ligatures w14:val="none"/>
+        </w:rPr>
+        <w:t>[Date]</w:t>
+      </w:r>
+      <w:r>
+        <w:rPr>
+          <w:rFonts w:ascii="Arial" w:eastAsia="ＭＳ Ｐゴシック" w:hAnsi="Arial" w:cs="Arial"/>
+          <w:kern w:val="0"/>
+          <w:sz w:val="24"/>
+          <w14:ligatures w14:val="none"/>
+        </w:rPr>
+        <w:t>,</w:t>
       </w:r>
       <w:proofErr w:type="gramEnd"/>
       <w:r>
         <w:rPr>
-          <w:rFonts w:ascii="Arial" w:hAnsi="Arial" w:cs="Arial"/>
-        </w:rPr>
-        <w:t xml:space="preserve"> libraries and frameworks</w:t>
+          <w:rFonts w:ascii="Arial" w:eastAsia="ＭＳ Ｐゴシック" w:hAnsi="Arial" w:cs="Arial"/>
+          <w:kern w:val="0"/>
+          <w:sz w:val="24"/>
+          <w14:ligatures w14:val="none"/>
+        </w:rPr>
+        <w:t xml:space="preserve"> to</w:t>
+      </w:r>
+      <w:r>
+        <w:rPr>
+          <w:rFonts w:ascii="Arial" w:eastAsia="ＭＳ Ｐゴシック" w:hAnsi="Arial" w:cs="Arial"/>
+          <w:kern w:val="0"/>
+          <w:sz w:val="24"/>
+          <w14:ligatures w14:val="none"/>
+        </w:rPr>
+        <w:t xml:space="preserve"> </w:t>
+      </w:r>
+      <w:r>
+        <w:rPr>
+          <w:rFonts w:ascii="Arial" w:eastAsia="ＭＳ Ｐゴシック" w:hAnsi="Arial" w:cs="Arial"/>
+          <w:color w:val="EE0000"/>
+          <w:kern w:val="0"/>
+          <w:sz w:val="24"/>
+          <w14:ligatures w14:val="none"/>
+        </w:rPr>
+        <w:t>[Date].</w:t>
+      </w:r>
+    </w:p>
+    <w:p>
+      <w:pPr>
+        <w:widowControl/>
+        <w:spacing w:after="0" w:line="240" w:lineRule="auto"/>
+        <w:rPr>
+          <w:rFonts w:ascii="Arial" w:eastAsia="ＭＳ Ｐゴシック" w:hAnsi="Arial" w:cs="Arial"/>
+          <w:kern w:val="0"/>
+          <w:sz w:val="24"/>
+          <w14:ligatures w14:val="none"/>
+        </w:rPr>
+      </w:pPr>
+    </w:p>
+    <w:p>
+      <w:pPr>
+        <w:widowControl/>
+        <w:spacing w:before="100" w:beforeAutospacing="1" w:after="100" w:afterAutospacing="1" w:line="240" w:lineRule="auto"/>
+        <w:outlineLvl w:val="1"/>
+        <w:rPr>
+          <w:rFonts w:ascii="Arial" w:eastAsia="ＭＳ Ｐゴシック" w:hAnsi="Arial" w:cs="Arial"/>
+          <w:b/>
+          <w:bCs/>
+          <w:kern w:val="0"/>
+          <w:sz w:val="36"/>
+          <w:szCs w:val="36"/>
+          <w14:ligatures w14:val="none"/>
+        </w:rPr>
+      </w:pPr>
+      <w:r>
+        <w:rPr>
+          <w:rFonts w:ascii="Arial" w:eastAsia="ＭＳ Ｐゴシック" w:hAnsi="Arial" w:cs="Arial"/>
+          <w:b/>
+          <w:bCs/>
+          <w:kern w:val="0"/>
+          <w:sz w:val="36"/>
+          <w:szCs w:val="36"/>
+          <w14:ligatures w14:val="none"/>
+        </w:rPr>
+        <w:t>19</w:t>
+      </w:r>
+      <w:r>
+        <w:rPr>
+          <w:rFonts w:ascii="Arial" w:eastAsia="ＭＳ Ｐゴシック" w:hAnsi="Arial" w:cs="Arial"/>
+          <w:b/>
+          <w:bCs/>
+          <w:kern w:val="0"/>
+          <w:sz w:val="36"/>
+          <w:szCs w:val="36"/>
+          <w14:ligatures w14:val="none"/>
+        </w:rPr>
+        <w:t>. Termination</w:t>
       </w:r>
     </w:p>
     <w:p>
@@ -1709,7 +2179,7 @@
         <w:rPr>
           <w:rFonts w:ascii="Arial" w:hAnsi="Arial" w:cs="Arial"/>
         </w:rPr>
-        <w:t>- Reusable components developed by Party A for other projects</w:t>
+        <w:t>1. Termination for Material Breach</w:t>
       </w:r>
     </w:p>
     <w:p>
@@ -1723,7 +2193,148 @@
         <w:rPr>
           <w:rFonts w:ascii="Arial" w:hAnsi="Arial" w:cs="Arial"/>
         </w:rPr>
-        <w:t>- General user interface elements and layouts</w:t>
+        <w:t xml:space="preserve">Either party may immediately terminate this Agreement without notice if the other party commits a material breach, suspends payment, </w:t>
+      </w:r>
+      <w:proofErr w:type="gramStart"/>
+      <w:r>
+        <w:rPr>
+          <w:rFonts w:ascii="Arial" w:hAnsi="Arial" w:cs="Arial"/>
+        </w:rPr>
+        <w:t>enters into</w:t>
+      </w:r>
+      <w:proofErr w:type="gramEnd"/>
+      <w:r>
+        <w:rPr>
+          <w:rFonts w:ascii="Arial" w:hAnsi="Arial" w:cs="Arial"/>
+        </w:rPr>
+        <w:t xml:space="preserve"> bankruptcy or similar proceedings, or otherwise becomes unable to perform this Agreement.</w:t>
+      </w:r>
+    </w:p>
+    <w:p>
+      <w:pPr>
+        <w:pStyle w:val="Web"/>
+        <w:rPr>
+          <w:rFonts w:ascii="Arial" w:hAnsi="Arial" w:cs="Arial"/>
+        </w:rPr>
+      </w:pPr>
+      <w:r>
+        <w:rPr>
+          <w:rFonts w:ascii="Arial" w:hAnsi="Arial" w:cs="Arial"/>
+        </w:rPr>
+        <w:t>2. Cure Period</w:t>
+      </w:r>
+    </w:p>
+    <w:p>
+      <w:pPr>
+        <w:pStyle w:val="Web"/>
+        <w:rPr>
+          <w:rFonts w:ascii="Arial" w:hAnsi="Arial" w:cs="Arial"/>
+        </w:rPr>
+      </w:pPr>
+      <w:r>
+        <w:rPr>
+          <w:rFonts w:ascii="Arial" w:hAnsi="Arial" w:cs="Arial"/>
+        </w:rPr>
+        <w:t>In the event of a contract breach, the breaching party shall be given a 30-day opportunity to cure such breach after receiving written notice. If the breach is not cured within this period, the other party may terminate this Agreement.</w:t>
+      </w:r>
+    </w:p>
+    <w:p>
+      <w:pPr>
+        <w:pStyle w:val="Web"/>
+        <w:rPr>
+          <w:rFonts w:ascii="Arial" w:hAnsi="Arial" w:cs="Arial"/>
+        </w:rPr>
+      </w:pPr>
+      <w:r>
+        <w:rPr>
+          <w:rFonts w:ascii="Arial" w:hAnsi="Arial" w:cs="Arial"/>
+        </w:rPr>
+        <w:t>3. Settlement Procedures upon Termination</w:t>
+      </w:r>
+    </w:p>
+    <w:p>
+      <w:pPr>
+        <w:pStyle w:val="Web"/>
+        <w:rPr>
+          <w:rFonts w:ascii="Arial" w:hAnsi="Arial" w:cs="Arial"/>
+        </w:rPr>
+      </w:pPr>
+      <w:r>
+        <w:rPr>
+          <w:rFonts w:ascii="Arial" w:hAnsi="Arial" w:cs="Arial"/>
+        </w:rPr>
+        <w:lastRenderedPageBreak/>
+        <w:t>- Upon termination, Party A shall have the right to receive appropriate compensation for work already completed</w:t>
+      </w:r>
+    </w:p>
+    <w:p>
+      <w:pPr>
+        <w:pStyle w:val="Web"/>
+        <w:rPr>
+          <w:rFonts w:ascii="Arial" w:hAnsi="Arial" w:cs="Arial"/>
+        </w:rPr>
+      </w:pPr>
+      <w:r>
+        <w:rPr>
+          <w:rFonts w:ascii="Arial" w:hAnsi="Arial" w:cs="Arial"/>
+        </w:rPr>
+        <w:t>- Party B shall be obligated to pay for deliverables completed up to the termination date</w:t>
+      </w:r>
+    </w:p>
+    <w:p>
+      <w:pPr>
+        <w:pStyle w:val="Web"/>
+        <w:rPr>
+          <w:rFonts w:ascii="Arial" w:hAnsi="Arial" w:cs="Arial"/>
+        </w:rPr>
+      </w:pPr>
+      <w:r>
+        <w:rPr>
+          <w:rFonts w:ascii="Arial" w:hAnsi="Arial" w:cs="Arial"/>
+        </w:rPr>
+        <w:t>- Party A shall return all materials provided by Party B within ten (10) days after termination</w:t>
+      </w:r>
+    </w:p>
+    <w:p>
+      <w:pPr>
+        <w:pStyle w:val="Web"/>
+        <w:rPr>
+          <w:rFonts w:ascii="Arial" w:hAnsi="Arial" w:cs="Arial"/>
+        </w:rPr>
+      </w:pPr>
+      <w:r>
+        <w:rPr>
+          <w:rFonts w:ascii="Arial" w:hAnsi="Arial" w:cs="Arial"/>
+        </w:rPr>
+        <w:t>- Confidentiality obligations shall continue after termination</w:t>
+      </w:r>
+    </w:p>
+    <w:p>
+      <w:pPr>
+        <w:pStyle w:val="Web"/>
+        <w:rPr>
+          <w:rFonts w:ascii="Arial" w:hAnsi="Arial" w:cs="Arial"/>
+        </w:rPr>
+      </w:pPr>
+      <w:r>
+        <w:rPr>
+          <w:rFonts w:ascii="Arial" w:hAnsi="Arial" w:cs="Arial"/>
+        </w:rPr>
+        <w:t>4. Effect of Termination</w:t>
+      </w:r>
+    </w:p>
+    <w:p>
+      <w:pPr>
+        <w:pStyle w:val="Web"/>
+        <w:rPr>
+          <w:rFonts w:ascii="Arial" w:hAnsi="Arial" w:cs="Arial"/>
+        </w:rPr>
+      </w:pPr>
+      <w:r>
+        <w:rPr>
+          <w:rFonts w:ascii="Arial" w:hAnsi="Arial" w:cs="Arial"/>
+        </w:rPr>
+        <w:t>Termination of this Agreement shall not relieve either party of obligations incurred prior to termination.</w:t>
       </w:r>
     </w:p>
     <w:p>
@@ -1763,148 +2374,255 @@
           <w:szCs w:val="36"/>
           <w14:ligatures w14:val="none"/>
         </w:rPr>
+        <w:t>2</w:t>
+      </w:r>
+      <w:r>
+        <w:rPr>
+          <w:rFonts w:ascii="Arial" w:eastAsia="ＭＳ Ｐゴシック" w:hAnsi="Arial" w:cs="Arial"/>
+          <w:b/>
+          <w:bCs/>
+          <w:kern w:val="0"/>
+          <w:sz w:val="36"/>
+          <w:szCs w:val="36"/>
+          <w14:ligatures w14:val="none"/>
+        </w:rPr>
+        <w:t>0</w:t>
+      </w:r>
+      <w:r>
+        <w:rPr>
+          <w:rFonts w:ascii="Arial" w:eastAsia="ＭＳ Ｐゴシック" w:hAnsi="Arial" w:cs="Arial"/>
+          <w:b/>
+          <w:bCs/>
+          <w:kern w:val="0"/>
+          <w:sz w:val="36"/>
+          <w:szCs w:val="36"/>
+          <w14:ligatures w14:val="none"/>
+        </w:rPr>
+        <w:t>. Non-Assignment</w:t>
+      </w:r>
+    </w:p>
+    <w:p>
+      <w:pPr>
+        <w:widowControl/>
+        <w:spacing w:before="100" w:beforeAutospacing="1" w:after="100" w:afterAutospacing="1" w:line="240" w:lineRule="auto"/>
+        <w:rPr>
+          <w:rFonts w:ascii="Arial" w:eastAsia="ＭＳ Ｐゴシック" w:hAnsi="Arial" w:cs="Arial"/>
+          <w:kern w:val="0"/>
+          <w:sz w:val="24"/>
+          <w14:ligatures w14:val="none"/>
+        </w:rPr>
+      </w:pPr>
+      <w:r>
+        <w:rPr>
+          <w:rFonts w:ascii="Arial" w:eastAsia="ＭＳ Ｐゴシック" w:hAnsi="Arial" w:cs="Arial"/>
+          <w:kern w:val="0"/>
+          <w:sz w:val="24"/>
+          <w14:ligatures w14:val="none"/>
+        </w:rPr>
+        <w:t>Neither party may assign its rights or obligations under this Agreement to a third party without the prior written consent of the other party.</w:t>
+      </w:r>
+    </w:p>
+    <w:p>
+      <w:pPr>
+        <w:widowControl/>
+        <w:spacing w:after="0" w:line="240" w:lineRule="auto"/>
+        <w:rPr>
+          <w:rFonts w:ascii="Arial" w:eastAsia="ＭＳ Ｐゴシック" w:hAnsi="Arial" w:cs="Arial"/>
+          <w:kern w:val="0"/>
+          <w:sz w:val="24"/>
+          <w14:ligatures w14:val="none"/>
+        </w:rPr>
+      </w:pPr>
+    </w:p>
+    <w:p>
+      <w:pPr>
+        <w:widowControl/>
+        <w:spacing w:before="100" w:beforeAutospacing="1" w:after="100" w:afterAutospacing="1" w:line="240" w:lineRule="auto"/>
+        <w:outlineLvl w:val="1"/>
+        <w:rPr>
+          <w:rFonts w:ascii="Arial" w:eastAsia="ＭＳ Ｐゴシック" w:hAnsi="Arial" w:cs="Arial"/>
+          <w:b/>
+          <w:bCs/>
+          <w:kern w:val="0"/>
+          <w:sz w:val="36"/>
+          <w:szCs w:val="36"/>
+          <w14:ligatures w14:val="none"/>
+        </w:rPr>
+      </w:pPr>
+      <w:r>
+        <w:rPr>
+          <w:rFonts w:ascii="Arial" w:eastAsia="ＭＳ Ｐゴシック" w:hAnsi="Arial" w:cs="Arial"/>
+          <w:b/>
+          <w:bCs/>
+          <w:kern w:val="0"/>
+          <w:sz w:val="36"/>
+          <w:szCs w:val="36"/>
+          <w14:ligatures w14:val="none"/>
+        </w:rPr>
+        <w:t>2</w:t>
+      </w:r>
+      <w:r>
+        <w:rPr>
+          <w:rFonts w:ascii="Arial" w:eastAsia="ＭＳ Ｐゴシック" w:hAnsi="Arial" w:cs="Arial"/>
+          <w:b/>
+          <w:bCs/>
+          <w:kern w:val="0"/>
+          <w:sz w:val="36"/>
+          <w:szCs w:val="36"/>
+          <w14:ligatures w14:val="none"/>
+        </w:rPr>
+        <w:t>1</w:t>
+      </w:r>
+      <w:r>
+        <w:rPr>
+          <w:rFonts w:ascii="Arial" w:eastAsia="ＭＳ Ｐゴシック" w:hAnsi="Arial" w:cs="Arial"/>
+          <w:b/>
+          <w:bCs/>
+          <w:kern w:val="0"/>
+          <w:sz w:val="36"/>
+          <w:szCs w:val="36"/>
+          <w14:ligatures w14:val="none"/>
+        </w:rPr>
+        <w:t>. Good Faith Consultation</w:t>
+      </w:r>
+    </w:p>
+    <w:p>
+      <w:pPr>
+        <w:widowControl/>
+        <w:spacing w:before="100" w:beforeAutospacing="1" w:after="100" w:afterAutospacing="1" w:line="240" w:lineRule="auto"/>
+        <w:rPr>
+          <w:rFonts w:ascii="Arial" w:eastAsia="ＭＳ Ｐゴシック" w:hAnsi="Arial" w:cs="Arial"/>
+          <w:kern w:val="0"/>
+          <w:sz w:val="24"/>
+          <w14:ligatures w14:val="none"/>
+        </w:rPr>
+      </w:pPr>
+      <w:r>
+        <w:rPr>
+          <w:rFonts w:ascii="Arial" w:eastAsia="ＭＳ Ｐゴシック" w:hAnsi="Arial" w:cs="Arial"/>
+          <w:kern w:val="0"/>
+          <w:sz w:val="24"/>
+          <w14:ligatures w14:val="none"/>
+        </w:rPr>
+        <w:t>Any matters not stipulated in this Agreement shall be resolved by mutual consultation in good faith between the parties.</w:t>
+      </w:r>
+    </w:p>
+    <w:p>
+      <w:pPr>
+        <w:widowControl/>
+        <w:spacing w:after="0" w:line="240" w:lineRule="auto"/>
+        <w:rPr>
+          <w:rFonts w:ascii="Arial" w:eastAsia="ＭＳ Ｐゴシック" w:hAnsi="Arial" w:cs="Arial"/>
+          <w:kern w:val="0"/>
+          <w:sz w:val="24"/>
+          <w14:ligatures w14:val="none"/>
+        </w:rPr>
+      </w:pPr>
+    </w:p>
+    <w:p>
+      <w:pPr>
+        <w:widowControl/>
+        <w:spacing w:before="100" w:beforeAutospacing="1" w:after="100" w:afterAutospacing="1" w:line="240" w:lineRule="auto"/>
+        <w:outlineLvl w:val="1"/>
+        <w:rPr>
+          <w:rFonts w:ascii="Arial" w:eastAsia="ＭＳ Ｐゴシック" w:hAnsi="Arial" w:cs="Arial"/>
+          <w:b/>
+          <w:bCs/>
+          <w:kern w:val="0"/>
+          <w:sz w:val="36"/>
+          <w:szCs w:val="36"/>
+          <w14:ligatures w14:val="none"/>
+        </w:rPr>
+      </w:pPr>
+    </w:p>
+    <w:p>
+      <w:pPr>
+        <w:widowControl/>
+        <w:spacing w:before="100" w:beforeAutospacing="1" w:after="100" w:afterAutospacing="1" w:line="240" w:lineRule="auto"/>
+        <w:outlineLvl w:val="1"/>
+        <w:rPr>
+          <w:rFonts w:ascii="Arial" w:eastAsia="ＭＳ Ｐゴシック" w:hAnsi="Arial" w:cs="Arial"/>
+          <w:b/>
+          <w:bCs/>
+          <w:kern w:val="0"/>
+          <w:sz w:val="36"/>
+          <w:szCs w:val="36"/>
+          <w14:ligatures w14:val="none"/>
+        </w:rPr>
+      </w:pPr>
+    </w:p>
+    <w:p>
+      <w:pPr>
+        <w:widowControl/>
+        <w:spacing w:before="100" w:beforeAutospacing="1" w:after="100" w:afterAutospacing="1" w:line="240" w:lineRule="auto"/>
+        <w:outlineLvl w:val="1"/>
+        <w:rPr>
+          <w:rFonts w:ascii="Arial" w:eastAsia="ＭＳ Ｐゴシック" w:hAnsi="Arial" w:cs="Arial"/>
+          <w:b/>
+          <w:bCs/>
+          <w:kern w:val="0"/>
+          <w:sz w:val="36"/>
+          <w:szCs w:val="36"/>
+          <w14:ligatures w14:val="none"/>
+        </w:rPr>
+      </w:pPr>
+      <w:r>
+        <w:rPr>
+          <w:rFonts w:ascii="Arial" w:eastAsia="ＭＳ Ｐゴシック" w:hAnsi="Arial" w:cs="Arial"/>
+          <w:b/>
+          <w:bCs/>
+          <w:kern w:val="0"/>
+          <w:sz w:val="36"/>
+          <w:szCs w:val="36"/>
+          <w14:ligatures w14:val="none"/>
+        </w:rPr>
         <w:lastRenderedPageBreak/>
-        <w:t>19. Liability and Compensation</w:t>
-      </w:r>
-    </w:p>
-    <w:p>
-      <w:pPr>
-        <w:pStyle w:val="Web"/>
-        <w:rPr>
-          <w:rFonts w:ascii="Arial" w:hAnsi="Arial" w:cs="Arial"/>
-        </w:rPr>
-      </w:pPr>
-      <w:r>
-        <w:rPr>
-          <w:rFonts w:ascii="Arial" w:hAnsi="Arial" w:cs="Arial"/>
-        </w:rPr>
-        <w:t>1. Liability for Damages</w:t>
-      </w:r>
-    </w:p>
-    <w:p>
-      <w:pPr>
-        <w:pStyle w:val="Web"/>
-        <w:rPr>
-          <w:rFonts w:ascii="Arial" w:hAnsi="Arial" w:cs="Arial"/>
-        </w:rPr>
-      </w:pPr>
-      <w:r>
-        <w:rPr>
-          <w:rFonts w:ascii="Arial" w:hAnsi="Arial" w:cs="Arial"/>
-        </w:rPr>
-        <w:t>Party A shall be liable for damages arising from infringement of third-party rights or defects in the Deliverables, provided that such liability shall be limited to 200% of the total amount of the outsourcing fee.</w:t>
-      </w:r>
-    </w:p>
-    <w:p>
-      <w:pPr>
-        <w:pStyle w:val="Web"/>
-        <w:rPr>
-          <w:rFonts w:ascii="Arial" w:hAnsi="Arial" w:cs="Arial"/>
-        </w:rPr>
-      </w:pPr>
-      <w:r>
-        <w:rPr>
-          <w:rFonts w:ascii="Arial" w:hAnsi="Arial" w:cs="Arial"/>
-        </w:rPr>
-        <w:t>2. Exclusion of Indirect Damages</w:t>
-      </w:r>
-    </w:p>
-    <w:p>
-      <w:pPr>
-        <w:pStyle w:val="Web"/>
-        <w:rPr>
-          <w:rFonts w:ascii="Arial" w:hAnsi="Arial" w:cs="Arial"/>
-        </w:rPr>
-      </w:pPr>
-      <w:r>
-        <w:rPr>
-          <w:rFonts w:ascii="Arial" w:hAnsi="Arial" w:cs="Arial"/>
-        </w:rPr>
-        <w:t>Party A shall not be liable for lost profits, loss of opportunity, indirect damages, special damages, or punitive damages.</w:t>
-      </w:r>
-    </w:p>
-    <w:p>
-      <w:pPr>
-        <w:pStyle w:val="Web"/>
-        <w:rPr>
-          <w:rFonts w:ascii="Arial" w:hAnsi="Arial" w:cs="Arial"/>
-        </w:rPr>
-      </w:pPr>
-      <w:r>
-        <w:rPr>
-          <w:rFonts w:ascii="Arial" w:hAnsi="Arial" w:cs="Arial"/>
-        </w:rPr>
-        <w:t>3. Exemptions</w:t>
-      </w:r>
-    </w:p>
-    <w:p>
-      <w:pPr>
-        <w:pStyle w:val="Web"/>
-        <w:rPr>
-          <w:rFonts w:ascii="Arial" w:hAnsi="Arial" w:cs="Arial"/>
-        </w:rPr>
-      </w:pPr>
-      <w:r>
-        <w:rPr>
-          <w:rFonts w:ascii="Arial" w:hAnsi="Arial" w:cs="Arial"/>
-        </w:rPr>
-        <w:t>Party A shall not be liable for damages in the following cases:</w:t>
-      </w:r>
-    </w:p>
-    <w:p>
-      <w:pPr>
-        <w:pStyle w:val="Web"/>
-        <w:rPr>
-          <w:rFonts w:ascii="Arial" w:hAnsi="Arial" w:cs="Arial"/>
-        </w:rPr>
-      </w:pPr>
-      <w:r>
-        <w:rPr>
-          <w:rFonts w:ascii="Arial" w:hAnsi="Arial" w:cs="Arial"/>
-        </w:rPr>
-        <w:t>- Damages caused by errors or deficiencies in materials provided by Party B</w:t>
-      </w:r>
-    </w:p>
-    <w:p>
-      <w:pPr>
-        <w:pStyle w:val="Web"/>
-        <w:rPr>
-          <w:rFonts w:ascii="Arial" w:hAnsi="Arial" w:cs="Arial"/>
-        </w:rPr>
-      </w:pPr>
-      <w:r>
-        <w:rPr>
-          <w:rFonts w:ascii="Arial" w:hAnsi="Arial" w:cs="Arial"/>
-        </w:rPr>
-        <w:t>- Damages arising from specification changes instructed by Party B</w:t>
-      </w:r>
-    </w:p>
-    <w:p>
-      <w:pPr>
-        <w:pStyle w:val="Web"/>
-        <w:rPr>
-          <w:rFonts w:ascii="Arial" w:hAnsi="Arial" w:cs="Arial"/>
-        </w:rPr>
-      </w:pPr>
-      <w:r>
-        <w:rPr>
-          <w:rFonts w:ascii="Arial" w:hAnsi="Arial" w:cs="Arial"/>
-        </w:rPr>
-        <w:t>- Damages caused by improper use or operation by Party B</w:t>
-      </w:r>
-    </w:p>
-    <w:p>
-      <w:pPr>
-        <w:pStyle w:val="Web"/>
-        <w:rPr>
-          <w:rFonts w:ascii="Arial" w:hAnsi="Arial" w:cs="Arial"/>
-        </w:rPr>
-      </w:pPr>
-      <w:r>
-        <w:rPr>
-          <w:rFonts w:ascii="Arial" w:hAnsi="Arial" w:cs="Arial"/>
-        </w:rPr>
-        <w:t>- Damages caused by unauthorized access or tampering by third parties</w:t>
+        <w:t>2</w:t>
+      </w:r>
+      <w:r>
+        <w:rPr>
+          <w:rFonts w:ascii="Arial" w:eastAsia="ＭＳ Ｐゴシック" w:hAnsi="Arial" w:cs="Arial"/>
+          <w:b/>
+          <w:bCs/>
+          <w:kern w:val="0"/>
+          <w:sz w:val="36"/>
+          <w:szCs w:val="36"/>
+          <w14:ligatures w14:val="none"/>
+        </w:rPr>
+        <w:t>2</w:t>
+      </w:r>
+      <w:r>
+        <w:rPr>
+          <w:rFonts w:ascii="Arial" w:eastAsia="ＭＳ Ｐゴシック" w:hAnsi="Arial" w:cs="Arial"/>
+          <w:b/>
+          <w:bCs/>
+          <w:kern w:val="0"/>
+          <w:sz w:val="36"/>
+          <w:szCs w:val="36"/>
+          <w14:ligatures w14:val="none"/>
+        </w:rPr>
+        <w:t>. Governing Law and Jurisdiction</w:t>
+      </w:r>
+    </w:p>
+    <w:p>
+      <w:pPr>
+        <w:widowControl/>
+        <w:spacing w:before="100" w:beforeAutospacing="1" w:after="100" w:afterAutospacing="1" w:line="240" w:lineRule="auto"/>
+        <w:rPr>
+          <w:rFonts w:ascii="Arial" w:eastAsia="ＭＳ Ｐゴシック" w:hAnsi="Arial" w:cs="Arial"/>
+          <w:kern w:val="0"/>
+          <w:sz w:val="24"/>
+          <w14:ligatures w14:val="none"/>
+        </w:rPr>
+      </w:pPr>
+      <w:r>
+        <w:rPr>
+          <w:rFonts w:ascii="Arial" w:eastAsia="ＭＳ Ｐゴシック" w:hAnsi="Arial" w:cs="Arial"/>
+          <w:kern w:val="0"/>
+          <w:sz w:val="24"/>
+          <w14:ligatures w14:val="none"/>
+        </w:rPr>
+        <w:t>This Agreement shall be governed by the laws of Japan, and the exclusive jurisdiction for any disputes arising hereunder shall be the courts of Tokyo, Japan.</w:t>
       </w:r>
     </w:p>
     <w:p>
@@ -1923,575 +2641,84 @@
       <w:pPr>
         <w:widowControl/>
         <w:spacing w:before="100" w:beforeAutospacing="1" w:after="100" w:afterAutospacing="1" w:line="240" w:lineRule="auto"/>
-        <w:outlineLvl w:val="1"/>
-        <w:rPr>
-          <w:rFonts w:ascii="Arial" w:eastAsia="ＭＳ Ｐゴシック" w:hAnsi="Arial" w:cs="Arial"/>
-          <w:b/>
-          <w:bCs/>
-          <w:kern w:val="0"/>
-          <w:sz w:val="36"/>
-          <w:szCs w:val="36"/>
-          <w14:ligatures w14:val="none"/>
-        </w:rPr>
-      </w:pPr>
-      <w:r>
-        <w:rPr>
-          <w:rFonts w:ascii="Arial" w:eastAsia="ＭＳ Ｐゴシック" w:hAnsi="Arial" w:cs="Arial"/>
-          <w:b/>
-          <w:bCs/>
-          <w:kern w:val="0"/>
-          <w:sz w:val="36"/>
-          <w:szCs w:val="36"/>
-          <w14:ligatures w14:val="none"/>
-        </w:rPr>
-        <w:t>20. Term of Agreement</w:t>
-      </w:r>
-    </w:p>
-    <w:p>
-      <w:pPr>
-        <w:widowControl/>
-        <w:spacing w:before="100" w:beforeAutospacing="1" w:after="100" w:afterAutospacing="1" w:line="240" w:lineRule="auto"/>
-        <w:rPr>
-          <w:rFonts w:ascii="Arial" w:eastAsia="ＭＳ Ｐゴシック" w:hAnsi="Arial" w:cs="Arial"/>
-          <w:kern w:val="0"/>
-          <w:sz w:val="24"/>
-          <w14:ligatures w14:val="none"/>
-        </w:rPr>
-      </w:pPr>
-      <w:r>
-        <w:rPr>
-          <w:rFonts w:ascii="Arial" w:eastAsia="ＭＳ Ｐゴシック" w:hAnsi="Arial" w:cs="Arial"/>
-          <w:kern w:val="0"/>
-          <w:sz w:val="24"/>
-          <w14:ligatures w14:val="none"/>
-        </w:rPr>
-        <w:t xml:space="preserve">The term of this Agreement shall be </w:t>
-      </w:r>
-      <w:proofErr w:type="gramStart"/>
-      <w:r>
-        <w:rPr>
-          <w:rFonts w:ascii="Arial" w:eastAsia="ＭＳ Ｐゴシック" w:hAnsi="Arial" w:cs="Arial"/>
-          <w:kern w:val="0"/>
-          <w:sz w:val="24"/>
-          <w14:ligatures w14:val="none"/>
-        </w:rPr>
-        <w:t>from</w:t>
-      </w:r>
-      <w:r>
-        <w:rPr>
-          <w:rFonts w:ascii="Arial" w:eastAsia="ＭＳ Ｐゴシック" w:hAnsi="Arial" w:cs="Arial"/>
-          <w:kern w:val="0"/>
-          <w:sz w:val="24"/>
-          <w14:ligatures w14:val="none"/>
-        </w:rPr>
-        <w:t xml:space="preserve"> </w:t>
-      </w:r>
-      <w:r>
-        <w:rPr>
-          <w:rFonts w:ascii="Arial" w:eastAsia="ＭＳ Ｐゴシック" w:hAnsi="Arial" w:cs="Arial"/>
-          <w:color w:val="EE0000"/>
-          <w:kern w:val="0"/>
-          <w:sz w:val="24"/>
-          <w14:ligatures w14:val="none"/>
-        </w:rPr>
-        <w:t>[Date]</w:t>
-      </w:r>
-      <w:r>
-        <w:rPr>
-          <w:rFonts w:ascii="Arial" w:eastAsia="ＭＳ Ｐゴシック" w:hAnsi="Arial" w:cs="Arial"/>
-          <w:kern w:val="0"/>
-          <w:sz w:val="24"/>
-          <w14:ligatures w14:val="none"/>
-        </w:rPr>
-        <w:t>,</w:t>
-      </w:r>
-      <w:proofErr w:type="gramEnd"/>
-      <w:r>
-        <w:rPr>
-          <w:rFonts w:ascii="Arial" w:eastAsia="ＭＳ Ｐゴシック" w:hAnsi="Arial" w:cs="Arial"/>
-          <w:kern w:val="0"/>
-          <w:sz w:val="24"/>
-          <w14:ligatures w14:val="none"/>
-        </w:rPr>
-        <w:t xml:space="preserve"> to</w:t>
-      </w:r>
-      <w:r>
-        <w:rPr>
-          <w:rFonts w:ascii="Arial" w:eastAsia="ＭＳ Ｐゴシック" w:hAnsi="Arial" w:cs="Arial"/>
-          <w:kern w:val="0"/>
-          <w:sz w:val="24"/>
-          <w14:ligatures w14:val="none"/>
-        </w:rPr>
-        <w:t xml:space="preserve"> </w:t>
-      </w:r>
-      <w:r>
-        <w:rPr>
-          <w:rFonts w:ascii="Arial" w:eastAsia="ＭＳ Ｐゴシック" w:hAnsi="Arial" w:cs="Arial"/>
-          <w:color w:val="EE0000"/>
-          <w:kern w:val="0"/>
-          <w:sz w:val="24"/>
-          <w14:ligatures w14:val="none"/>
-        </w:rPr>
-        <w:t>[Date].</w:t>
-      </w:r>
-    </w:p>
-    <w:p>
-      <w:pPr>
-        <w:widowControl/>
-        <w:spacing w:after="0" w:line="240" w:lineRule="auto"/>
-        <w:rPr>
-          <w:rFonts w:ascii="Arial" w:eastAsia="ＭＳ Ｐゴシック" w:hAnsi="Arial" w:cs="Arial"/>
-          <w:kern w:val="0"/>
-          <w:sz w:val="24"/>
-          <w14:ligatures w14:val="none"/>
-        </w:rPr>
-      </w:pPr>
-    </w:p>
-    <w:p>
-      <w:pPr>
-        <w:widowControl/>
-        <w:spacing w:before="100" w:beforeAutospacing="1" w:after="100" w:afterAutospacing="1" w:line="240" w:lineRule="auto"/>
-        <w:outlineLvl w:val="1"/>
-        <w:rPr>
-          <w:rFonts w:ascii="Arial" w:eastAsia="ＭＳ Ｐゴシック" w:hAnsi="Arial" w:cs="Arial"/>
-          <w:b/>
-          <w:bCs/>
-          <w:kern w:val="0"/>
-          <w:sz w:val="36"/>
-          <w:szCs w:val="36"/>
-          <w14:ligatures w14:val="none"/>
-        </w:rPr>
-      </w:pPr>
-      <w:r>
-        <w:rPr>
-          <w:rFonts w:ascii="Arial" w:eastAsia="ＭＳ Ｐゴシック" w:hAnsi="Arial" w:cs="Arial"/>
-          <w:b/>
-          <w:bCs/>
-          <w:kern w:val="0"/>
-          <w:sz w:val="36"/>
-          <w:szCs w:val="36"/>
-          <w14:ligatures w14:val="none"/>
-        </w:rPr>
-        <w:t>21. Termination</w:t>
-      </w:r>
-    </w:p>
-    <w:p>
-      <w:pPr>
-        <w:pStyle w:val="Web"/>
-        <w:rPr>
-          <w:rFonts w:ascii="Arial" w:hAnsi="Arial" w:cs="Arial"/>
-        </w:rPr>
-      </w:pPr>
-      <w:r>
-        <w:rPr>
-          <w:rFonts w:ascii="Arial" w:hAnsi="Arial" w:cs="Arial"/>
-        </w:rPr>
-        <w:t>1. Termination for Material Breach</w:t>
-      </w:r>
-    </w:p>
-    <w:p>
-      <w:pPr>
-        <w:pStyle w:val="Web"/>
-        <w:rPr>
-          <w:rFonts w:ascii="Arial" w:hAnsi="Arial" w:cs="Arial"/>
-        </w:rPr>
-      </w:pPr>
-      <w:r>
-        <w:rPr>
-          <w:rFonts w:ascii="Arial" w:hAnsi="Arial" w:cs="Arial"/>
-        </w:rPr>
-        <w:lastRenderedPageBreak/>
-        <w:t xml:space="preserve">Either party may immediately terminate this Agreement without notice if the other party commits a material breach, suspends payment, </w:t>
-      </w:r>
-      <w:proofErr w:type="gramStart"/>
-      <w:r>
-        <w:rPr>
-          <w:rFonts w:ascii="Arial" w:hAnsi="Arial" w:cs="Arial"/>
-        </w:rPr>
-        <w:t>enters into</w:t>
-      </w:r>
-      <w:proofErr w:type="gramEnd"/>
-      <w:r>
-        <w:rPr>
-          <w:rFonts w:ascii="Arial" w:hAnsi="Arial" w:cs="Arial"/>
-        </w:rPr>
-        <w:t xml:space="preserve"> bankruptcy or similar proceedings, or otherwise becomes unable to perform this Agreement.</w:t>
-      </w:r>
-    </w:p>
-    <w:p>
-      <w:pPr>
-        <w:pStyle w:val="Web"/>
-        <w:rPr>
-          <w:rFonts w:ascii="Arial" w:hAnsi="Arial" w:cs="Arial"/>
-        </w:rPr>
-      </w:pPr>
-      <w:r>
-        <w:rPr>
-          <w:rFonts w:ascii="Arial" w:hAnsi="Arial" w:cs="Arial"/>
-        </w:rPr>
-        <w:t>2. Cure Period</w:t>
-      </w:r>
-    </w:p>
-    <w:p>
-      <w:pPr>
-        <w:pStyle w:val="Web"/>
-        <w:rPr>
-          <w:rFonts w:ascii="Arial" w:hAnsi="Arial" w:cs="Arial"/>
-        </w:rPr>
-      </w:pPr>
-      <w:r>
-        <w:rPr>
-          <w:rFonts w:ascii="Arial" w:hAnsi="Arial" w:cs="Arial"/>
-        </w:rPr>
-        <w:t>In the event of a contract breach, the breaching party shall be given a 30-day opportunity to cure such breach after receiving written notice. If the breach is not cured within this period, the other party may terminate this Agreement.</w:t>
-      </w:r>
-    </w:p>
-    <w:p>
-      <w:pPr>
-        <w:pStyle w:val="Web"/>
-        <w:rPr>
-          <w:rFonts w:ascii="Arial" w:hAnsi="Arial" w:cs="Arial"/>
-        </w:rPr>
-      </w:pPr>
-      <w:r>
-        <w:rPr>
-          <w:rFonts w:ascii="Arial" w:hAnsi="Arial" w:cs="Arial"/>
-        </w:rPr>
-        <w:t>3. Settlement Procedures upon Termination</w:t>
-      </w:r>
-    </w:p>
-    <w:p>
-      <w:pPr>
-        <w:pStyle w:val="Web"/>
-        <w:rPr>
-          <w:rFonts w:ascii="Arial" w:hAnsi="Arial" w:cs="Arial"/>
-        </w:rPr>
-      </w:pPr>
-      <w:r>
-        <w:rPr>
-          <w:rFonts w:ascii="Arial" w:hAnsi="Arial" w:cs="Arial"/>
-        </w:rPr>
-        <w:t>- Upon termination, Party A shall have the right to receive appropriate compensation for work already completed</w:t>
-      </w:r>
-    </w:p>
-    <w:p>
-      <w:pPr>
-        <w:pStyle w:val="Web"/>
-        <w:rPr>
-          <w:rFonts w:ascii="Arial" w:hAnsi="Arial" w:cs="Arial"/>
-        </w:rPr>
-      </w:pPr>
-      <w:r>
-        <w:rPr>
-          <w:rFonts w:ascii="Arial" w:hAnsi="Arial" w:cs="Arial"/>
-        </w:rPr>
-        <w:t>- Party B shall be obligated to pay for deliverables completed up to the termination date</w:t>
-      </w:r>
-    </w:p>
-    <w:p>
-      <w:pPr>
-        <w:pStyle w:val="Web"/>
-        <w:rPr>
-          <w:rFonts w:ascii="Arial" w:hAnsi="Arial" w:cs="Arial"/>
-        </w:rPr>
-      </w:pPr>
-      <w:r>
-        <w:rPr>
-          <w:rFonts w:ascii="Arial" w:hAnsi="Arial" w:cs="Arial"/>
-        </w:rPr>
-        <w:t>- Party A shall return all materials provided by Party B within ten (10) days after termination</w:t>
-      </w:r>
-    </w:p>
-    <w:p>
-      <w:pPr>
-        <w:pStyle w:val="Web"/>
-        <w:rPr>
-          <w:rFonts w:ascii="Arial" w:hAnsi="Arial" w:cs="Arial"/>
-        </w:rPr>
-      </w:pPr>
-      <w:r>
-        <w:rPr>
-          <w:rFonts w:ascii="Arial" w:hAnsi="Arial" w:cs="Arial"/>
-        </w:rPr>
-        <w:t>- Confidentiality obligations shall continue after termination</w:t>
-      </w:r>
-    </w:p>
-    <w:p>
-      <w:pPr>
-        <w:pStyle w:val="Web"/>
-        <w:rPr>
-          <w:rFonts w:ascii="Arial" w:hAnsi="Arial" w:cs="Arial"/>
-        </w:rPr>
-      </w:pPr>
-      <w:r>
-        <w:rPr>
-          <w:rFonts w:ascii="Arial" w:hAnsi="Arial" w:cs="Arial"/>
-        </w:rPr>
-        <w:t>4. Effect of Termination</w:t>
-      </w:r>
-    </w:p>
-    <w:p>
-      <w:pPr>
-        <w:pStyle w:val="Web"/>
-        <w:rPr>
-          <w:rFonts w:ascii="Arial" w:hAnsi="Arial" w:cs="Arial"/>
-        </w:rPr>
-      </w:pPr>
-      <w:r>
-        <w:rPr>
-          <w:rFonts w:ascii="Arial" w:hAnsi="Arial" w:cs="Arial"/>
-        </w:rPr>
-        <w:t>Termination of this Agreement shall not relieve either party of obligations incurred prior to termination.</w:t>
-      </w:r>
-    </w:p>
-    <w:p>
-      <w:pPr>
-        <w:widowControl/>
-        <w:spacing w:after="0" w:line="240" w:lineRule="auto"/>
-        <w:rPr>
-          <w:rFonts w:ascii="Arial" w:eastAsia="ＭＳ Ｐゴシック" w:hAnsi="Arial" w:cs="Arial"/>
-          <w:kern w:val="0"/>
-          <w:sz w:val="24"/>
-          <w14:ligatures w14:val="none"/>
-        </w:rPr>
-      </w:pPr>
-    </w:p>
-    <w:p>
-      <w:pPr>
-        <w:widowControl/>
-        <w:spacing w:before="100" w:beforeAutospacing="1" w:after="100" w:afterAutospacing="1" w:line="240" w:lineRule="auto"/>
-        <w:outlineLvl w:val="1"/>
-        <w:rPr>
-          <w:rFonts w:ascii="Arial" w:eastAsia="ＭＳ Ｐゴシック" w:hAnsi="Arial" w:cs="Arial"/>
-          <w:b/>
-          <w:bCs/>
-          <w:kern w:val="0"/>
-          <w:sz w:val="36"/>
-          <w:szCs w:val="36"/>
-          <w14:ligatures w14:val="none"/>
-        </w:rPr>
-      </w:pPr>
-      <w:r>
-        <w:rPr>
-          <w:rFonts w:ascii="Arial" w:eastAsia="ＭＳ Ｐゴシック" w:hAnsi="Arial" w:cs="Arial"/>
-          <w:b/>
-          <w:bCs/>
-          <w:kern w:val="0"/>
-          <w:sz w:val="36"/>
-          <w:szCs w:val="36"/>
-          <w14:ligatures w14:val="none"/>
-        </w:rPr>
-        <w:t>22. Non-Assignment</w:t>
-      </w:r>
-    </w:p>
-    <w:p>
-      <w:pPr>
-        <w:widowControl/>
-        <w:spacing w:before="100" w:beforeAutospacing="1" w:after="100" w:afterAutospacing="1" w:line="240" w:lineRule="auto"/>
-        <w:rPr>
-          <w:rFonts w:ascii="Arial" w:eastAsia="ＭＳ Ｐゴシック" w:hAnsi="Arial" w:cs="Arial"/>
-          <w:kern w:val="0"/>
-          <w:sz w:val="24"/>
-          <w14:ligatures w14:val="none"/>
-        </w:rPr>
-      </w:pPr>
-      <w:r>
-        <w:rPr>
-          <w:rFonts w:ascii="Arial" w:eastAsia="ＭＳ Ｐゴシック" w:hAnsi="Arial" w:cs="Arial"/>
-          <w:kern w:val="0"/>
-          <w:sz w:val="24"/>
-          <w14:ligatures w14:val="none"/>
-        </w:rPr>
-        <w:t>Neither party may assign its rights or obligations under this Agreement to a third party without the prior written consent of the other party.</w:t>
-      </w:r>
-    </w:p>
-    <w:p>
-      <w:pPr>
-        <w:widowControl/>
-        <w:spacing w:after="0" w:line="240" w:lineRule="auto"/>
-        <w:rPr>
-          <w:rFonts w:ascii="Arial" w:eastAsia="ＭＳ Ｐゴシック" w:hAnsi="Arial" w:cs="Arial"/>
-          <w:kern w:val="0"/>
-          <w:sz w:val="24"/>
-          <w14:ligatures w14:val="none"/>
-        </w:rPr>
-      </w:pPr>
-    </w:p>
-    <w:p>
-      <w:pPr>
-        <w:widowControl/>
-        <w:spacing w:before="100" w:beforeAutospacing="1" w:after="100" w:afterAutospacing="1" w:line="240" w:lineRule="auto"/>
-        <w:outlineLvl w:val="1"/>
-        <w:rPr>
-          <w:rFonts w:ascii="Arial" w:eastAsia="ＭＳ Ｐゴシック" w:hAnsi="Arial" w:cs="Arial"/>
-          <w:b/>
-          <w:bCs/>
-          <w:kern w:val="0"/>
-          <w:sz w:val="36"/>
-          <w:szCs w:val="36"/>
-          <w14:ligatures w14:val="none"/>
-        </w:rPr>
-      </w:pPr>
-      <w:r>
-        <w:rPr>
-          <w:rFonts w:ascii="Arial" w:eastAsia="ＭＳ Ｐゴシック" w:hAnsi="Arial" w:cs="Arial"/>
-          <w:b/>
-          <w:bCs/>
-          <w:kern w:val="0"/>
-          <w:sz w:val="36"/>
-          <w:szCs w:val="36"/>
-          <w14:ligatures w14:val="none"/>
-        </w:rPr>
-        <w:lastRenderedPageBreak/>
-        <w:t>23. Good Faith Consultation</w:t>
-      </w:r>
-    </w:p>
-    <w:p>
-      <w:pPr>
-        <w:widowControl/>
-        <w:spacing w:before="100" w:beforeAutospacing="1" w:after="100" w:afterAutospacing="1" w:line="240" w:lineRule="auto"/>
-        <w:rPr>
-          <w:rFonts w:ascii="Arial" w:eastAsia="ＭＳ Ｐゴシック" w:hAnsi="Arial" w:cs="Arial"/>
-          <w:kern w:val="0"/>
-          <w:sz w:val="24"/>
-          <w14:ligatures w14:val="none"/>
-        </w:rPr>
-      </w:pPr>
-      <w:r>
-        <w:rPr>
-          <w:rFonts w:ascii="Arial" w:eastAsia="ＭＳ Ｐゴシック" w:hAnsi="Arial" w:cs="Arial"/>
-          <w:kern w:val="0"/>
-          <w:sz w:val="24"/>
-          <w14:ligatures w14:val="none"/>
-        </w:rPr>
-        <w:t>Any matters not stipulated in this Agreement shall be resolved by mutual consultation in good faith between the parties.</w:t>
-      </w:r>
-    </w:p>
-    <w:p>
-      <w:pPr>
-        <w:widowControl/>
-        <w:spacing w:after="0" w:line="240" w:lineRule="auto"/>
-        <w:rPr>
-          <w:rFonts w:ascii="Arial" w:eastAsia="ＭＳ Ｐゴシック" w:hAnsi="Arial" w:cs="Arial"/>
-          <w:kern w:val="0"/>
-          <w:sz w:val="24"/>
-          <w14:ligatures w14:val="none"/>
-        </w:rPr>
-      </w:pPr>
-    </w:p>
-    <w:p>
-      <w:pPr>
-        <w:widowControl/>
-        <w:spacing w:before="100" w:beforeAutospacing="1" w:after="100" w:afterAutospacing="1" w:line="240" w:lineRule="auto"/>
-        <w:outlineLvl w:val="1"/>
-        <w:rPr>
-          <w:rFonts w:ascii="Arial" w:eastAsia="ＭＳ Ｐゴシック" w:hAnsi="Arial" w:cs="Arial"/>
-          <w:b/>
-          <w:bCs/>
-          <w:kern w:val="0"/>
-          <w:sz w:val="36"/>
-          <w:szCs w:val="36"/>
-          <w14:ligatures w14:val="none"/>
-        </w:rPr>
-      </w:pPr>
-      <w:r>
-        <w:rPr>
-          <w:rFonts w:ascii="Arial" w:eastAsia="ＭＳ Ｐゴシック" w:hAnsi="Arial" w:cs="Arial"/>
-          <w:b/>
-          <w:bCs/>
-          <w:kern w:val="0"/>
-          <w:sz w:val="36"/>
-          <w:szCs w:val="36"/>
-          <w14:ligatures w14:val="none"/>
-        </w:rPr>
-        <w:t>24. Governing Law and Jurisdiction</w:t>
-      </w:r>
-    </w:p>
-    <w:p>
-      <w:pPr>
-        <w:widowControl/>
-        <w:spacing w:before="100" w:beforeAutospacing="1" w:after="100" w:afterAutospacing="1" w:line="240" w:lineRule="auto"/>
-        <w:rPr>
-          <w:rFonts w:ascii="Arial" w:eastAsia="ＭＳ Ｐゴシック" w:hAnsi="Arial" w:cs="Arial"/>
-          <w:kern w:val="0"/>
-          <w:sz w:val="24"/>
-          <w14:ligatures w14:val="none"/>
-        </w:rPr>
-      </w:pPr>
-      <w:r>
-        <w:rPr>
-          <w:rFonts w:ascii="Arial" w:eastAsia="ＭＳ Ｐゴシック" w:hAnsi="Arial" w:cs="Arial"/>
-          <w:kern w:val="0"/>
-          <w:sz w:val="24"/>
-          <w14:ligatures w14:val="none"/>
-        </w:rPr>
-        <w:t>This Agreement shall be governed by the laws of Japan, and the exclusive jurisdiction for any disputes arising hereunder shall be the courts of Tokyo, Japan.</w:t>
-      </w:r>
-    </w:p>
-    <w:p>
-      <w:pPr>
-        <w:widowControl/>
-        <w:spacing w:after="0" w:line="240" w:lineRule="auto"/>
-        <w:rPr>
-          <w:rFonts w:ascii="Arial" w:eastAsia="ＭＳ Ｐゴシック" w:hAnsi="Arial" w:cs="Arial"/>
-          <w:kern w:val="0"/>
-          <w:sz w:val="24"/>
-          <w14:ligatures w14:val="none"/>
-        </w:rPr>
-      </w:pPr>
-    </w:p>
-    <w:p>
-      <w:pPr>
-        <w:widowControl/>
-        <w:spacing w:before="100" w:beforeAutospacing="1" w:after="100" w:afterAutospacing="1" w:line="240" w:lineRule="auto"/>
-        <w:rPr>
-          <w:rFonts w:ascii="Arial" w:eastAsia="ＭＳ Ｐゴシック" w:hAnsi="Arial" w:cs="Arial"/>
-          <w:b/>
-          <w:bCs/>
-          <w:kern w:val="0"/>
-          <w:sz w:val="24"/>
-          <w14:ligatures w14:val="none"/>
-        </w:rPr>
-      </w:pPr>
-    </w:p>
-    <w:p>
-      <w:pPr>
-        <w:widowControl/>
-        <w:spacing w:before="100" w:beforeAutospacing="1" w:after="100" w:afterAutospacing="1" w:line="240" w:lineRule="auto"/>
-        <w:rPr>
-          <w:rFonts w:ascii="Arial" w:eastAsia="ＭＳ Ｐゴシック" w:hAnsi="Arial" w:cs="Arial"/>
-          <w:b/>
-          <w:bCs/>
-          <w:kern w:val="0"/>
-          <w:sz w:val="24"/>
-          <w14:ligatures w14:val="none"/>
-        </w:rPr>
-      </w:pPr>
-    </w:p>
-    <w:p>
-      <w:pPr>
-        <w:widowControl/>
-        <w:spacing w:before="100" w:beforeAutospacing="1" w:after="100" w:afterAutospacing="1" w:line="240" w:lineRule="auto"/>
-        <w:rPr>
-          <w:rFonts w:ascii="Arial" w:eastAsia="ＭＳ Ｐゴシック" w:hAnsi="Arial" w:cs="Arial"/>
-          <w:b/>
-          <w:bCs/>
-          <w:kern w:val="0"/>
-          <w:sz w:val="24"/>
-          <w14:ligatures w14:val="none"/>
-        </w:rPr>
-      </w:pPr>
-    </w:p>
-    <w:p>
-      <w:pPr>
-        <w:widowControl/>
-        <w:spacing w:before="100" w:beforeAutospacing="1" w:after="100" w:afterAutospacing="1" w:line="240" w:lineRule="auto"/>
-        <w:rPr>
-          <w:rFonts w:ascii="Arial" w:eastAsia="ＭＳ Ｐゴシック" w:hAnsi="Arial" w:cs="Arial"/>
-          <w:b/>
-          <w:bCs/>
-          <w:kern w:val="0"/>
-          <w:sz w:val="24"/>
+        <w:rPr>
+          <w:rFonts w:ascii="Arial" w:eastAsia="ＭＳ Ｐゴシック" w:hAnsi="Arial" w:cs="Arial"/>
+          <w:b/>
+          <w:bCs/>
+          <w:kern w:val="0"/>
+          <w:sz w:val="24"/>
+          <w14:ligatures w14:val="none"/>
+        </w:rPr>
+      </w:pPr>
+    </w:p>
+    <w:p>
+      <w:pPr>
+        <w:widowControl/>
+        <w:spacing w:before="100" w:beforeAutospacing="1" w:after="100" w:afterAutospacing="1" w:line="240" w:lineRule="auto"/>
+        <w:rPr>
+          <w:rFonts w:ascii="Arial" w:eastAsia="ＭＳ Ｐゴシック" w:hAnsi="Arial" w:cs="Arial"/>
+          <w:b/>
+          <w:bCs/>
+          <w:kern w:val="0"/>
+          <w:sz w:val="24"/>
+          <w14:ligatures w14:val="none"/>
+        </w:rPr>
+      </w:pPr>
+    </w:p>
+    <w:p>
+      <w:pPr>
+        <w:widowControl/>
+        <w:spacing w:before="100" w:beforeAutospacing="1" w:after="100" w:afterAutospacing="1" w:line="240" w:lineRule="auto"/>
+        <w:rPr>
+          <w:rFonts w:ascii="Arial" w:eastAsia="ＭＳ Ｐゴシック" w:hAnsi="Arial" w:cs="Arial"/>
+          <w:b/>
+          <w:bCs/>
+          <w:kern w:val="0"/>
+          <w:sz w:val="24"/>
+          <w14:ligatures w14:val="none"/>
+        </w:rPr>
+      </w:pPr>
+    </w:p>
+    <w:p>
+      <w:pPr>
+        <w:widowControl/>
+        <w:spacing w:before="100" w:beforeAutospacing="1" w:after="100" w:afterAutospacing="1" w:line="240" w:lineRule="auto"/>
+        <w:rPr>
+          <w:rFonts w:ascii="Arial" w:eastAsia="ＭＳ Ｐゴシック" w:hAnsi="Arial" w:cs="Arial"/>
+          <w:b/>
+          <w:bCs/>
+          <w:kern w:val="0"/>
+          <w:sz w:val="24"/>
+          <w14:ligatures w14:val="none"/>
+        </w:rPr>
+      </w:pPr>
+    </w:p>
+    <w:p>
+      <w:pPr>
+        <w:widowControl/>
+        <w:spacing w:before="100" w:beforeAutospacing="1" w:after="100" w:afterAutospacing="1" w:line="240" w:lineRule="auto"/>
+        <w:rPr>
+          <w:rFonts w:ascii="Arial" w:eastAsia="ＭＳ Ｐゴシック" w:hAnsi="Arial" w:cs="Arial"/>
+          <w:b/>
+          <w:bCs/>
+          <w:kern w:val="0"/>
+          <w:sz w:val="28"/>
+          <w:szCs w:val="28"/>
+          <w14:ligatures w14:val="none"/>
+        </w:rPr>
+      </w:pPr>
+    </w:p>
+    <w:p>
+      <w:pPr>
+        <w:widowControl/>
+        <w:spacing w:before="100" w:beforeAutospacing="1" w:after="100" w:afterAutospacing="1" w:line="240" w:lineRule="auto"/>
+        <w:rPr>
+          <w:rFonts w:ascii="Arial" w:eastAsia="ＭＳ Ｐゴシック" w:hAnsi="Arial" w:cs="Arial"/>
+          <w:b/>
+          <w:bCs/>
+          <w:kern w:val="0"/>
+          <w:sz w:val="28"/>
+          <w:szCs w:val="28"/>
           <w14:ligatures w14:val="none"/>
         </w:rPr>
       </w:pPr>

</xml_diff>